<commit_message>
docs: actualizar informe Word con aclaracion de criterios para el cliente
</commit_message>
<xml_diff>
--- a/public/informe_avance_personal_fichas_adicionales.docx
+++ b/public/informe_avance_personal_fichas_adicionales.docx
@@ -5,7 +5,7 @@
     <w:p>
       <w:pPr>
         <w:shd w:val="clear" w:color="auto" w:fill="F0F9FF"/>
-        <w:divId w:val="1174804533"/>
+        <w:divId w:val="811486768"/>
         <w:rPr>
           <w:rFonts w:ascii="Calibri" w:eastAsia="Times New Roman" w:hAnsi="Calibri" w:cs="Calibri"/>
           <w:b/>
@@ -28,7 +28,7 @@
     <w:p>
       <w:pPr>
         <w:shd w:val="clear" w:color="auto" w:fill="F0F9FF"/>
-        <w:divId w:val="785319614"/>
+        <w:divId w:val="437918672"/>
         <w:rPr>
           <w:rFonts w:ascii="Calibri" w:eastAsia="Times New Roman" w:hAnsi="Calibri" w:cs="Calibri"/>
           <w:color w:val="1E293B"/>
@@ -56,7 +56,7 @@
     <w:p>
       <w:pPr>
         <w:shd w:val="clear" w:color="auto" w:fill="F0F9FF"/>
-        <w:divId w:val="518664519"/>
+        <w:divId w:val="340669340"/>
         <w:rPr>
           <w:rFonts w:ascii="Calibri" w:eastAsia="Times New Roman" w:hAnsi="Calibri" w:cs="Calibri"/>
           <w:color w:val="1E293B"/>
@@ -86,13 +86,13 @@
           <w:color w:val="1E293B"/>
           <w:lang w:val="es-ES"/>
         </w:rPr>
-        <w:t>24 de Julio de 2026 (Datos al corte del 23 de Julio de 2026)</w:t>
+        <w:t>24 de Julio de 2026 (Corte al 23 de Julio de 2026)</w:t>
       </w:r>
     </w:p>
     <w:p>
       <w:pPr>
         <w:shd w:val="clear" w:color="auto" w:fill="F0F9FF"/>
-        <w:divId w:val="290139913"/>
+        <w:divId w:val="1833791430"/>
         <w:rPr>
           <w:rFonts w:ascii="Calibri" w:eastAsia="Times New Roman" w:hAnsi="Calibri" w:cs="Calibri"/>
           <w:color w:val="1E293B"/>
@@ -120,7 +120,7 @@
     <w:p>
       <w:pPr>
         <w:pStyle w:val="Ttulo1"/>
-        <w:divId w:val="657348125"/>
+        <w:divId w:val="109663700"/>
         <w:rPr>
           <w:rFonts w:ascii="Calibri" w:eastAsia="Times New Roman" w:hAnsi="Calibri" w:cs="Calibri"/>
           <w:lang w:val="es-ES"/>
@@ -137,7 +137,7 @@
     <w:p>
       <w:pPr>
         <w:pStyle w:val="Ttulo2"/>
-        <w:divId w:val="657348125"/>
+        <w:divId w:val="109663700"/>
         <w:rPr>
           <w:rFonts w:ascii="Calibri" w:eastAsia="Times New Roman" w:hAnsi="Calibri" w:cs="Calibri"/>
           <w:lang w:val="es-ES"/>
@@ -154,7 +154,7 @@
     <w:p>
       <w:pPr>
         <w:pStyle w:val="NormalWeb"/>
-        <w:divId w:val="657348125"/>
+        <w:divId w:val="109663700"/>
         <w:rPr>
           <w:rFonts w:ascii="Calibri" w:hAnsi="Calibri" w:cs="Calibri"/>
           <w:color w:val="1E293B"/>
@@ -167,7 +167,7 @@
           <w:color w:val="1E293B"/>
           <w:lang w:val="es-ES"/>
         </w:rPr>
-        <w:t>El universo de predios</w:t>
+        <w:t>El universo de predios adicional</w:t>
       </w:r>
       <w:r>
         <w:rPr>
@@ -175,7 +175,7 @@
           <w:color w:val="1E293B"/>
           <w:lang w:val="es-ES"/>
         </w:rPr>
-        <w:t xml:space="preserve"> adicionales declarados en la Sección 7 asciende a </w:t>
+        <w:t xml:space="preserve">es declarados en la Sección 7 asciende a </w:t>
       </w:r>
       <w:r>
         <w:rPr>
@@ -207,14 +207,14 @@
         <w:tblLook w:val="04A0" w:firstRow="1" w:lastRow="0" w:firstColumn="1" w:lastColumn="0" w:noHBand="0" w:noVBand="1"/>
       </w:tblPr>
       <w:tblGrid>
-        <w:gridCol w:w="2081"/>
-        <w:gridCol w:w="1491"/>
+        <w:gridCol w:w="1902"/>
+        <w:gridCol w:w="1379"/>
         <w:gridCol w:w="1257"/>
-        <w:gridCol w:w="3659"/>
+        <w:gridCol w:w="3950"/>
       </w:tblGrid>
       <w:tr>
         <w:trPr>
-          <w:divId w:val="657348125"/>
+          <w:divId w:val="109663700"/>
           <w:tblHeader/>
         </w:trPr>
         <w:tc>
@@ -389,7 +389,7 @@
                 <w:sz w:val="20"/>
                 <w:szCs w:val="20"/>
               </w:rPr>
-              <w:t>Método / Origen de Ca</w:t>
+              <w:t>Definición Operativa para la Ge</w:t>
             </w:r>
             <w:r>
               <w:rPr>
@@ -400,14 +400,14 @@
                 <w:sz w:val="20"/>
                 <w:szCs w:val="20"/>
               </w:rPr>
-              <w:t>rga</w:t>
+              <w:t>stión</w:t>
             </w:r>
           </w:p>
         </w:tc>
       </w:tr>
       <w:tr>
         <w:trPr>
-          <w:divId w:val="657348125"/>
+          <w:divId w:val="109663700"/>
         </w:trPr>
         <w:tc>
           <w:tcPr>
@@ -562,14 +562,14 @@
                 <w:sz w:val="20"/>
                 <w:szCs w:val="20"/>
               </w:rPr>
-              <w:t>Investigación directa en terreno por técnicos</w:t>
+              <w:t>Investigadas, verificadas y cerradas 100% por los técnicos en terreno.</w:t>
             </w:r>
           </w:p>
         </w:tc>
       </w:tr>
       <w:tr>
         <w:trPr>
-          <w:divId w:val="657348125"/>
+          <w:divId w:val="109663700"/>
         </w:trPr>
         <w:tc>
           <w:tcPr>
@@ -606,7 +606,7 @@
                 <w:sz w:val="20"/>
                 <w:szCs w:val="20"/>
               </w:rPr>
-              <w:t>En Revisión (Script Histórico)</w:t>
+              <w:t>En Revisión (Pre-cargadas)</w:t>
             </w:r>
           </w:p>
         </w:tc>
@@ -724,30 +724,14 @@
                 <w:sz w:val="20"/>
                 <w:szCs w:val="20"/>
               </w:rPr>
-              <w:t>Recuperación histórica por script (</w:t>
-            </w:r>
-            <w:r>
-              <w:rPr>
-                <w:rStyle w:val="CdigoHTML"/>
-                <w:color w:val="1E293B"/>
-              </w:rPr>
-              <w:t>jvk-digitalizacion</w:t>
-            </w:r>
-            <w:r>
-              <w:rPr>
-                <w:rFonts w:ascii="Calibri" w:eastAsia="Times New Roman" w:hAnsi="Calibri" w:cs="Calibri"/>
-                <w:color w:val="1E293B"/>
-                <w:sz w:val="20"/>
-                <w:szCs w:val="20"/>
-              </w:rPr>
-              <w:t>)</w:t>
+              <w:t>Fichas con datos de producción pre-cargados de inspecciones previas, en proceso de validación rápida.</w:t>
             </w:r>
           </w:p>
         </w:tc>
       </w:tr>
       <w:tr>
         <w:trPr>
-          <w:divId w:val="657348125"/>
+          <w:divId w:val="109663700"/>
         </w:trPr>
         <w:tc>
           <w:tcPr>
@@ -902,14 +886,14 @@
                 <w:sz w:val="20"/>
                 <w:szCs w:val="20"/>
               </w:rPr>
-              <w:t>Sección 4 vacía en espera de campo/oficina</w:t>
+              <w:t>Sección 4 vacía en programación de visita de campo.</w:t>
             </w:r>
           </w:p>
         </w:tc>
       </w:tr>
       <w:tr>
         <w:trPr>
-          <w:divId w:val="657348125"/>
+          <w:divId w:val="109663700"/>
         </w:trPr>
         <w:tc>
           <w:tcPr>
@@ -1083,7 +1067,7 @@
                 <w:sz w:val="20"/>
                 <w:szCs w:val="20"/>
               </w:rPr>
-              <w:t>Universo total de predios adicionales</w:t>
+              <w:t>Universo total de predios adicionales declarados en Sección 7.</w:t>
             </w:r>
           </w:p>
         </w:tc>
@@ -1092,7 +1076,7 @@
     <w:p>
       <w:pPr>
         <w:pStyle w:val="Ttulo2"/>
-        <w:divId w:val="657348125"/>
+        <w:divId w:val="109663700"/>
         <w:rPr>
           <w:rFonts w:ascii="Calibri" w:eastAsia="Times New Roman" w:hAnsi="Calibri" w:cs="Calibri"/>
           <w:lang w:val="es-ES"/>
@@ -1103,46 +1087,41 @@
           <w:rFonts w:ascii="Calibri" w:eastAsia="Times New Roman" w:hAnsi="Calibri" w:cs="Calibri"/>
           <w:lang w:val="es-ES"/>
         </w:rPr>
-        <w:t>2. Observaciones Metodológicas y Auditoría por Usuario (Corte 23-Julio)</w:t>
+        <w:t>2. Criterios Técnicos de Clasificación de Estados (Nota Aclaratoria para Supervisión)</w:t>
       </w:r>
     </w:p>
     <w:p>
       <w:pPr>
-        <w:pStyle w:val="Ttulo3"/>
-        <w:divId w:val="657348125"/>
-        <w:rPr>
-          <w:rFonts w:ascii="Calibri" w:eastAsia="Times New Roman" w:hAnsi="Calibri" w:cs="Calibri"/>
+        <w:shd w:val="clear" w:color="auto" w:fill="F0FDF4"/>
+        <w:divId w:val="1494371485"/>
+        <w:rPr>
+          <w:rFonts w:ascii="Calibri" w:eastAsia="Times New Roman" w:hAnsi="Calibri" w:cs="Calibri"/>
+          <w:color w:val="1E293B"/>
+          <w:sz w:val="21"/>
+          <w:szCs w:val="21"/>
           <w:lang w:val="es-ES"/>
         </w:rPr>
       </w:pPr>
       <w:r>
         <w:rPr>
           <w:rFonts w:ascii="Calibri" w:eastAsia="Times New Roman" w:hAnsi="Calibri" w:cs="Calibri"/>
+          <w:color w:val="1E293B"/>
+          <w:sz w:val="21"/>
+          <w:szCs w:val="21"/>
           <w:lang w:val="es-ES"/>
         </w:rPr>
         <w:lastRenderedPageBreak/>
-        <w:t xml:space="preserve">A. Usuario </w:t>
-      </w:r>
-      <w:r>
-        <w:rPr>
-          <w:rStyle w:val="CdigoHTML"/>
-          <w:lang w:val="es-ES"/>
-        </w:rPr>
-        <w:t>jvk-digitalizacion</w:t>
-      </w:r>
-      <w:r>
-        <w:rPr>
-          <w:rFonts w:ascii="Calibri" w:eastAsia="Times New Roman" w:hAnsi="Calibri" w:cs="Calibri"/>
-          <w:lang w:val="es-ES"/>
-        </w:rPr>
-        <w:t xml:space="preserve"> (Script de Recuperación Histórica</w:t>
-      </w:r>
-      <w:r>
-        <w:rPr>
-          <w:rFonts w:ascii="Calibri" w:eastAsia="Times New Roman" w:hAnsi="Calibri" w:cs="Calibri"/>
-          <w:lang w:val="es-ES"/>
-        </w:rPr>
-        <w:t xml:space="preserve"> — 103 Fichas)</w:t>
+        <w:t>Para garantizar absoluta claridad y transparencia en las auditorías de avance, los estados de investigació</w:t>
+      </w:r>
+      <w:r>
+        <w:rPr>
+          <w:rFonts w:ascii="Calibri" w:eastAsia="Times New Roman" w:hAnsi="Calibri" w:cs="Calibri"/>
+          <w:color w:val="1E293B"/>
+          <w:sz w:val="21"/>
+          <w:szCs w:val="21"/>
+          <w:lang w:val="es-ES"/>
+        </w:rPr>
+        <w:t xml:space="preserve">n de los predios adicionales se definen según los siguientes criterios: </w:t>
       </w:r>
     </w:p>
     <w:p>
@@ -1152,7 +1131,7 @@
           <w:numId w:val="1"/>
         </w:numPr>
         <w:spacing w:before="100" w:beforeAutospacing="1" w:after="100" w:afterAutospacing="1"/>
-        <w:divId w:val="657348125"/>
+        <w:divId w:val="109663700"/>
         <w:rPr>
           <w:rFonts w:ascii="Calibri" w:eastAsia="Times New Roman" w:hAnsi="Calibri" w:cs="Calibri"/>
           <w:color w:val="1E293B"/>
@@ -1164,23 +1143,45 @@
       <w:r>
         <w:rPr>
           <w:rStyle w:val="Textoennegrita"/>
-          <w:rFonts w:ascii="Calibri" w:eastAsia="Times New Roman" w:hAnsi="Calibri" w:cs="Calibri"/>
+          <w:rFonts w:ascii="Segoe UI Emoji" w:eastAsia="Times New Roman" w:hAnsi="Segoe UI Emoji" w:cs="Segoe UI Emoji"/>
           <w:color w:val="1E293B"/>
           <w:sz w:val="22"/>
           <w:szCs w:val="22"/>
           <w:lang w:val="es-ES"/>
         </w:rPr>
-        <w:t>Origen:</w:t>
-      </w:r>
-      <w:r>
-        <w:rPr>
+        <w:t>🟢</w:t>
+      </w:r>
+      <w:r>
+        <w:rPr>
+          <w:rStyle w:val="Textoennegrita"/>
           <w:rFonts w:ascii="Calibri" w:eastAsia="Times New Roman" w:hAnsi="Calibri" w:cs="Calibri"/>
           <w:color w:val="1E293B"/>
           <w:sz w:val="22"/>
           <w:szCs w:val="22"/>
           <w:lang w:val="es-ES"/>
         </w:rPr>
-        <w:t xml:space="preserve"> Corresponde a la corrida automatizada de recuperación de producción histórica basada en inspecciones previas de campo realizadas entre mayo y junio.</w:t>
+        <w:t xml:space="preserve"> Completada (100% Verificada en Campo):</w:t>
+      </w:r>
+      <w:r>
+        <w:rPr>
+          <w:rFonts w:ascii="Calibri" w:eastAsia="Times New Roman" w:hAnsi="Calibri" w:cs="Calibri"/>
+          <w:color w:val="1E293B"/>
+          <w:sz w:val="22"/>
+          <w:szCs w:val="22"/>
+          <w:lang w:val="es-ES"/>
+        </w:rPr>
+        <w:br/>
+        <w:t>Corresponde a predios adicionales donde el técnico de campo abrió la ficha en su dispositivo QField, entrevistó o confirmó directamente con e</w:t>
+      </w:r>
+      <w:r>
+        <w:rPr>
+          <w:rFonts w:ascii="Calibri" w:eastAsia="Times New Roman" w:hAnsi="Calibri" w:cs="Calibri"/>
+          <w:color w:val="1E293B"/>
+          <w:sz w:val="22"/>
+          <w:szCs w:val="22"/>
+          <w:lang w:val="es-ES"/>
+        </w:rPr>
+        <w:t>l regante la producción de la Sección 4 (cultivos, ganado y riego), y dio el cierre definitivo.</w:t>
       </w:r>
     </w:p>
     <w:p>
@@ -1190,7 +1191,7 @@
           <w:numId w:val="1"/>
         </w:numPr>
         <w:spacing w:before="100" w:beforeAutospacing="1" w:after="100" w:afterAutospacing="1"/>
-        <w:divId w:val="657348125"/>
+        <w:divId w:val="109663700"/>
         <w:rPr>
           <w:rFonts w:ascii="Calibri" w:eastAsia="Times New Roman" w:hAnsi="Calibri" w:cs="Calibri"/>
           <w:color w:val="1E293B"/>
@@ -1202,33 +1203,26 @@
       <w:r>
         <w:rPr>
           <w:rStyle w:val="Textoennegrita"/>
-          <w:rFonts w:ascii="Calibri" w:eastAsia="Times New Roman" w:hAnsi="Calibri" w:cs="Calibri"/>
+          <w:rFonts w:ascii="Segoe UI Emoji" w:eastAsia="Times New Roman" w:hAnsi="Segoe UI Emoji" w:cs="Segoe UI Emoji"/>
           <w:color w:val="1E293B"/>
           <w:sz w:val="22"/>
           <w:szCs w:val="22"/>
           <w:lang w:val="es-ES"/>
         </w:rPr>
-        <w:t>Auditoría de Sección 4 (¿Están completas?):</w:t>
-      </w:r>
-      <w:r>
-        <w:rPr>
+        <w:t>🔄</w:t>
+      </w:r>
+      <w:r>
+        <w:rPr>
+          <w:rStyle w:val="Textoennegrita"/>
           <w:rFonts w:ascii="Calibri" w:eastAsia="Times New Roman" w:hAnsi="Calibri" w:cs="Calibri"/>
           <w:color w:val="1E293B"/>
           <w:sz w:val="22"/>
           <w:szCs w:val="22"/>
           <w:lang w:val="es-ES"/>
         </w:rPr>
-        <w:t xml:space="preserve"> </w:t>
-      </w:r>
-    </w:p>
-    <w:p>
-      <w:pPr>
-        <w:numPr>
-          <w:ilvl w:val="1"/>
-          <w:numId w:val="1"/>
-        </w:numPr>
-        <w:spacing w:before="100" w:beforeAutospacing="1" w:after="100" w:afterAutospacing="1"/>
-        <w:divId w:val="657348125"/>
+        <w:t xml:space="preserve"> En Revisión (Fichas Pre-cargadas / En Validación):</w:t>
+      </w:r>
+      <w:r>
         <w:rPr>
           <w:rFonts w:ascii="Calibri" w:eastAsia="Times New Roman" w:hAnsi="Calibri" w:cs="Calibri"/>
           <w:color w:val="1E293B"/>
@@ -1236,7 +1230,9 @@
           <w:szCs w:val="22"/>
           <w:lang w:val="es-ES"/>
         </w:rPr>
-      </w:pPr>
+        <w:br/>
+        <w:t xml:space="preserve">Corresponde a fichas adicionales que </w:t>
+      </w:r>
       <w:r>
         <w:rPr>
           <w:rStyle w:val="Textoennegrita"/>
@@ -1246,7 +1242,7 @@
           <w:szCs w:val="22"/>
           <w:lang w:val="es-ES"/>
         </w:rPr>
-        <w:t>103 de 103 fichas (100%):</w:t>
+        <w:t>NO están vacías</w:t>
       </w:r>
       <w:r>
         <w:rPr>
@@ -1256,7 +1252,7 @@
           <w:szCs w:val="22"/>
           <w:lang w:val="es-ES"/>
         </w:rPr>
-        <w:t xml:space="preserve"> Tienen parcel</w:t>
+        <w:t>, sino que cuentan con información de producción pre-c</w:t>
       </w:r>
       <w:r>
         <w:rPr>
@@ -1266,17 +1262,9 @@
           <w:szCs w:val="22"/>
           <w:lang w:val="es-ES"/>
         </w:rPr>
-        <w:t>as agrícolas registradas en la tabla de cultivos.</w:t>
-      </w:r>
-    </w:p>
-    <w:p>
-      <w:pPr>
-        <w:numPr>
-          <w:ilvl w:val="1"/>
-          <w:numId w:val="1"/>
-        </w:numPr>
-        <w:spacing w:before="100" w:beforeAutospacing="1" w:after="100" w:afterAutospacing="1"/>
-        <w:divId w:val="657348125"/>
+        <w:t>argada proveniente de inspecciones y censos anteriores (mayo-junio).</w:t>
+      </w:r>
+      <w:r>
         <w:rPr>
           <w:rFonts w:ascii="Calibri" w:eastAsia="Times New Roman" w:hAnsi="Calibri" w:cs="Calibri"/>
           <w:color w:val="1E293B"/>
@@ -1284,17 +1272,18 @@
           <w:szCs w:val="22"/>
           <w:lang w:val="es-ES"/>
         </w:rPr>
-      </w:pPr>
-      <w:r>
-        <w:rPr>
-          <w:rStyle w:val="Textoennegrita"/>
+        <w:br/>
+      </w:r>
+      <w:r>
+        <w:rPr>
+          <w:rStyle w:val="nfasis"/>
           <w:rFonts w:ascii="Calibri" w:eastAsia="Times New Roman" w:hAnsi="Calibri" w:cs="Calibri"/>
           <w:color w:val="1E293B"/>
           <w:sz w:val="22"/>
           <w:szCs w:val="22"/>
           <w:lang w:val="es-ES"/>
         </w:rPr>
-        <w:t>52 de 103 fichas (50.5%):</w:t>
+        <w:t>¿Por qué están en este estado?</w:t>
       </w:r>
       <w:r>
         <w:rPr>
@@ -1304,17 +1293,17 @@
           <w:szCs w:val="22"/>
           <w:lang w:val="es-ES"/>
         </w:rPr>
-        <w:t xml:space="preserve"> Tienen especies pecuarias registradas en la tabla de ganado.</w:t>
-      </w:r>
-    </w:p>
-    <w:p>
-      <w:pPr>
-        <w:numPr>
-          <w:ilvl w:val="1"/>
-          <w:numId w:val="1"/>
-        </w:numPr>
-        <w:spacing w:before="100" w:beforeAutospacing="1" w:after="100" w:afterAutospacing="1"/>
-        <w:divId w:val="657348125"/>
+        <w:t xml:space="preserve"> Se registran como </w:t>
+      </w:r>
+      <w:r>
+        <w:rPr>
+          <w:rStyle w:val="CdigoHTML"/>
+          <w:color w:val="1E293B"/>
+          <w:lang w:val="es-ES"/>
+        </w:rPr>
+        <w:t>En Revisión</w:t>
+      </w:r>
+      <w:r>
         <w:rPr>
           <w:rFonts w:ascii="Calibri" w:eastAsia="Times New Roman" w:hAnsi="Calibri" w:cs="Calibri"/>
           <w:color w:val="1E293B"/>
@@ -1322,7 +1311,8 @@
           <w:szCs w:val="22"/>
           <w:lang w:val="es-ES"/>
         </w:rPr>
-      </w:pPr>
+        <w:t xml:space="preserve"> para que el técnico de campo las abra, confirme rápidamente con el regante que mantiene los mismos cultivos o animales, y con </w:t>
+      </w:r>
       <w:r>
         <w:rPr>
           <w:rFonts w:ascii="Calibri" w:eastAsia="Times New Roman" w:hAnsi="Calibri" w:cs="Calibri"/>
@@ -1331,29 +1321,25 @@
           <w:szCs w:val="22"/>
           <w:lang w:val="es-ES"/>
         </w:rPr>
-        <w:t xml:space="preserve">Todas poseen la observación: </w:t>
-      </w:r>
-      <w:r>
-        <w:rPr>
-          <w:rStyle w:val="nfasis"/>
+        <w:t xml:space="preserve">un solo clic cambie el estado a </w:t>
+      </w:r>
+      <w:r>
+        <w:rPr>
+          <w:rStyle w:val="CdigoHTML"/>
+          <w:color w:val="1E293B"/>
+          <w:lang w:val="es-ES"/>
+        </w:rPr>
+        <w:t>Completada</w:t>
+      </w:r>
+      <w:r>
+        <w:rPr>
           <w:rFonts w:ascii="Calibri" w:eastAsia="Times New Roman" w:hAnsi="Calibri" w:cs="Calibri"/>
           <w:color w:val="1E293B"/>
           <w:sz w:val="22"/>
           <w:szCs w:val="22"/>
           <w:lang w:val="es-ES"/>
         </w:rPr>
-        <w:t>"PRODUCCIÓN RECUPERADA de investigación de campo (...). Verificar con el regante y pasar a</w:t>
-      </w:r>
-      <w:r>
-        <w:rPr>
-          <w:rStyle w:val="nfasis"/>
-          <w:rFonts w:ascii="Calibri" w:eastAsia="Times New Roman" w:hAnsi="Calibri" w:cs="Calibri"/>
-          <w:color w:val="1E293B"/>
-          <w:sz w:val="22"/>
-          <w:szCs w:val="22"/>
-          <w:lang w:val="es-ES"/>
-        </w:rPr>
-        <w:t xml:space="preserve"> Completada."</w:t>
+        <w:t>. No requieren un levantamiento desde cero.</w:t>
       </w:r>
     </w:p>
     <w:p>
@@ -1363,7 +1349,7 @@
           <w:numId w:val="1"/>
         </w:numPr>
         <w:spacing w:before="100" w:beforeAutospacing="1" w:after="100" w:afterAutospacing="1"/>
-        <w:divId w:val="657348125"/>
+        <w:divId w:val="109663700"/>
         <w:rPr>
           <w:rFonts w:ascii="Calibri" w:eastAsia="Times New Roman" w:hAnsi="Calibri" w:cs="Calibri"/>
           <w:color w:val="1E293B"/>
@@ -1375,34 +1361,35 @@
       <w:r>
         <w:rPr>
           <w:rStyle w:val="Textoennegrita"/>
-          <w:rFonts w:ascii="Calibri" w:eastAsia="Times New Roman" w:hAnsi="Calibri" w:cs="Calibri"/>
+          <w:rFonts w:ascii="Segoe UI Emoji" w:eastAsia="Times New Roman" w:hAnsi="Segoe UI Emoji" w:cs="Segoe UI Emoji"/>
           <w:color w:val="1E293B"/>
           <w:sz w:val="22"/>
           <w:szCs w:val="22"/>
           <w:lang w:val="es-ES"/>
         </w:rPr>
-        <w:t>Estado:</w:t>
-      </w:r>
-      <w:r>
-        <w:rPr>
+        <w:t>⚪</w:t>
+      </w:r>
+      <w:r>
+        <w:rPr>
+          <w:rStyle w:val="Textoennegrita"/>
           <w:rFonts w:ascii="Calibri" w:eastAsia="Times New Roman" w:hAnsi="Calibri" w:cs="Calibri"/>
           <w:color w:val="1E293B"/>
           <w:sz w:val="22"/>
           <w:szCs w:val="22"/>
           <w:lang w:val="es-ES"/>
         </w:rPr>
-        <w:t xml:space="preserve"> Tienen </w:t>
-      </w:r>
-      <w:r>
-        <w:rPr>
-          <w:rStyle w:val="Textoennegrita"/>
+        <w:t xml:space="preserve"> Pendiente (Por Investigar en Campo):</w:t>
+      </w:r>
+      <w:r>
+        <w:rPr>
           <w:rFonts w:ascii="Calibri" w:eastAsia="Times New Roman" w:hAnsi="Calibri" w:cs="Calibri"/>
           <w:color w:val="1E293B"/>
           <w:sz w:val="22"/>
           <w:szCs w:val="22"/>
           <w:lang w:val="es-ES"/>
         </w:rPr>
-        <w:t>toda la producción completa</w:t>
+        <w:br/>
+        <w:t>Corresponde a predios adicionales donde la Sección 4 está completamente vacía y los técnicos deben realizar la visita de campo para</w:t>
       </w:r>
       <w:r>
         <w:rPr>
@@ -1412,49 +1399,13 @@
           <w:szCs w:val="22"/>
           <w:lang w:val="es-ES"/>
         </w:rPr>
-        <w:t xml:space="preserve">, pero 101 están marcadas como </w:t>
-      </w:r>
-      <w:r>
-        <w:rPr>
-          <w:rStyle w:val="CdigoHTML"/>
-          <w:color w:val="1E293B"/>
-          <w:lang w:val="es-ES"/>
-        </w:rPr>
-        <w:t>en_revision</w:t>
-      </w:r>
-      <w:r>
-        <w:rPr>
-          <w:rFonts w:ascii="Calibri" w:eastAsia="Times New Roman" w:hAnsi="Calibri" w:cs="Calibri"/>
-          <w:color w:val="1E293B"/>
-          <w:sz w:val="22"/>
-          <w:szCs w:val="22"/>
-          <w:lang w:val="es-ES"/>
-        </w:rPr>
-        <w:t xml:space="preserve"> y 2 como </w:t>
-      </w:r>
-      <w:r>
-        <w:rPr>
-          <w:rStyle w:val="CdigoHTML"/>
-          <w:color w:val="1E293B"/>
-          <w:lang w:val="es-ES"/>
-        </w:rPr>
-        <w:t>completada</w:t>
-      </w:r>
-      <w:r>
-        <w:rPr>
-          <w:rFonts w:ascii="Calibri" w:eastAsia="Times New Roman" w:hAnsi="Calibri" w:cs="Calibri"/>
-          <w:color w:val="1E293B"/>
-          <w:sz w:val="22"/>
-          <w:szCs w:val="22"/>
-          <w:lang w:val="es-ES"/>
-        </w:rPr>
-        <w:t xml:space="preserve"> para visto bueno técnico.</w:t>
+        <w:t xml:space="preserve"> tomar los datos agroeconómicos de primera mano.</w:t>
       </w:r>
     </w:p>
     <w:p>
       <w:pPr>
-        <w:pStyle w:val="Ttulo3"/>
-        <w:divId w:val="657348125"/>
+        <w:pStyle w:val="Ttulo2"/>
+        <w:divId w:val="109663700"/>
         <w:rPr>
           <w:rFonts w:ascii="Calibri" w:eastAsia="Times New Roman" w:hAnsi="Calibri" w:cs="Calibri"/>
           <w:lang w:val="es-ES"/>
@@ -1465,7 +1416,21 @@
           <w:rFonts w:ascii="Calibri" w:eastAsia="Times New Roman" w:hAnsi="Calibri" w:cs="Calibri"/>
           <w:lang w:val="es-ES"/>
         </w:rPr>
-        <w:t>B. Usuarios Técnicos de Campo (Investigación Directa en Terreno — 273 Fichas)</w:t>
+        <w:t xml:space="preserve">3. Auditoría de Carga Automatizada — Usuario </w:t>
+      </w:r>
+      <w:r>
+        <w:rPr>
+          <w:rStyle w:val="CdigoHTML"/>
+          <w:lang w:val="es-ES"/>
+        </w:rPr>
+        <w:t>jvk-digitalizacion</w:t>
+      </w:r>
+      <w:r>
+        <w:rPr>
+          <w:rFonts w:ascii="Calibri" w:eastAsia="Times New Roman" w:hAnsi="Calibri" w:cs="Calibri"/>
+          <w:lang w:val="es-ES"/>
+        </w:rPr>
+        <w:t xml:space="preserve"> (103 Fichas)</w:t>
       </w:r>
     </w:p>
     <w:p>
@@ -1475,7 +1440,7 @@
           <w:numId w:val="2"/>
         </w:numPr>
         <w:spacing w:before="100" w:beforeAutospacing="1" w:after="100" w:afterAutospacing="1"/>
-        <w:divId w:val="657348125"/>
+        <w:divId w:val="109663700"/>
         <w:rPr>
           <w:rFonts w:ascii="Calibri" w:eastAsia="Times New Roman" w:hAnsi="Calibri" w:cs="Calibri"/>
           <w:color w:val="1E293B"/>
@@ -1503,7 +1468,17 @@
           <w:szCs w:val="22"/>
           <w:lang w:val="es-ES"/>
         </w:rPr>
-        <w:t xml:space="preserve"> Levantamiento directo en terreno ejecutado por los técnicos mediante sus dispositivos móviles en QField.</w:t>
+        <w:t xml:space="preserve"> </w:t>
+      </w:r>
+      <w:r>
+        <w:rPr>
+          <w:rFonts w:ascii="Calibri" w:eastAsia="Times New Roman" w:hAnsi="Calibri" w:cs="Calibri"/>
+          <w:color w:val="1E293B"/>
+          <w:sz w:val="22"/>
+          <w:szCs w:val="22"/>
+          <w:lang w:val="es-ES"/>
+        </w:rPr>
+        <w:t>Corresponde a la corrida automatizada de recuperación de producción histórica basada en inspecciones previas de campo realizadas entre mayo y junio.</w:t>
       </w:r>
     </w:p>
     <w:p>
@@ -1513,7 +1488,7 @@
           <w:numId w:val="2"/>
         </w:numPr>
         <w:spacing w:before="100" w:beforeAutospacing="1" w:after="100" w:afterAutospacing="1"/>
-        <w:divId w:val="657348125"/>
+        <w:divId w:val="109663700"/>
         <w:rPr>
           <w:rFonts w:ascii="Calibri" w:eastAsia="Times New Roman" w:hAnsi="Calibri" w:cs="Calibri"/>
           <w:color w:val="1E293B"/>
@@ -1531,7 +1506,7 @@
           <w:szCs w:val="22"/>
           <w:lang w:val="es-ES"/>
         </w:rPr>
-        <w:t>Rendimiento Real de Campo el 23-Julio:</w:t>
+        <w:t>Auditoría de Sección 4 (¿Están completas?):</w:t>
       </w:r>
       <w:r>
         <w:rPr>
@@ -1551,7 +1526,7 @@
           <w:numId w:val="2"/>
         </w:numPr>
         <w:spacing w:before="100" w:beforeAutospacing="1" w:after="100" w:afterAutospacing="1"/>
-        <w:divId w:val="657348125"/>
+        <w:divId w:val="109663700"/>
         <w:rPr>
           <w:rFonts w:ascii="Calibri" w:eastAsia="Times New Roman" w:hAnsi="Calibri" w:cs="Calibri"/>
           <w:color w:val="1E293B"/>
@@ -1569,38 +1544,17 @@
           <w:szCs w:val="22"/>
           <w:lang w:val="es-ES"/>
         </w:rPr>
-        <w:t>Técnico Editor 6 (</w:t>
-      </w:r>
-      <w:r>
-        <w:rPr>
-          <w:rStyle w:val="CdigoHTML"/>
-          <w:b/>
-          <w:bCs/>
-          <w:color w:val="1E293B"/>
-          <w:lang w:val="es-ES"/>
-        </w:rPr>
-        <w:t>jvk-edi</w:t>
-      </w:r>
-      <w:r>
-        <w:rPr>
-          <w:rStyle w:val="CdigoHTML"/>
-          <w:b/>
-          <w:bCs/>
-          <w:color w:val="1E293B"/>
-          <w:lang w:val="es-ES"/>
-        </w:rPr>
-        <w:t>tor6</w:t>
-      </w:r>
-      <w:r>
-        <w:rPr>
-          <w:rStyle w:val="Textoennegrita"/>
+        <w:t>103 de 103 fichas (100%):</w:t>
+      </w:r>
+      <w:r>
+        <w:rPr>
           <w:rFonts w:ascii="Calibri" w:eastAsia="Times New Roman" w:hAnsi="Calibri" w:cs="Calibri"/>
           <w:color w:val="1E293B"/>
           <w:sz w:val="22"/>
           <w:szCs w:val="22"/>
           <w:lang w:val="es-ES"/>
         </w:rPr>
-        <w:t>):</w:t>
+        <w:t xml:space="preserve"> </w:t>
       </w:r>
       <w:r>
         <w:rPr>
@@ -1610,7 +1564,7 @@
           <w:szCs w:val="22"/>
           <w:lang w:val="es-ES"/>
         </w:rPr>
-        <w:t xml:space="preserve"> 116 fichas adicionales completadas en el día.</w:t>
+        <w:t>Tienen parcelas agrícolas registradas en la tabla de cultivos.</w:t>
       </w:r>
     </w:p>
     <w:p>
@@ -1620,7 +1574,7 @@
           <w:numId w:val="2"/>
         </w:numPr>
         <w:spacing w:before="100" w:beforeAutospacing="1" w:after="100" w:afterAutospacing="1"/>
-        <w:divId w:val="657348125"/>
+        <w:divId w:val="109663700"/>
         <w:rPr>
           <w:rFonts w:ascii="Calibri" w:eastAsia="Times New Roman" w:hAnsi="Calibri" w:cs="Calibri"/>
           <w:color w:val="1E293B"/>
@@ -1638,38 +1592,17 @@
           <w:szCs w:val="22"/>
           <w:lang w:val="es-ES"/>
         </w:rPr>
-        <w:t>Técnico Editor 4 (</w:t>
-      </w:r>
-      <w:r>
-        <w:rPr>
-          <w:rStyle w:val="CdigoHTML"/>
-          <w:b/>
-          <w:bCs/>
-          <w:color w:val="1E293B"/>
-          <w:lang w:val="es-ES"/>
-        </w:rPr>
-        <w:t>jvk-editor4</w:t>
-      </w:r>
-      <w:r>
-        <w:rPr>
-          <w:rStyle w:val="Textoennegrita"/>
+        <w:t>52 de 103 fichas (50.5%):</w:t>
+      </w:r>
+      <w:r>
+        <w:rPr>
           <w:rFonts w:ascii="Calibri" w:eastAsia="Times New Roman" w:hAnsi="Calibri" w:cs="Calibri"/>
           <w:color w:val="1E293B"/>
           <w:sz w:val="22"/>
           <w:szCs w:val="22"/>
           <w:lang w:val="es-ES"/>
         </w:rPr>
-        <w:t>):</w:t>
-      </w:r>
-      <w:r>
-        <w:rPr>
-          <w:rFonts w:ascii="Calibri" w:eastAsia="Times New Roman" w:hAnsi="Calibri" w:cs="Calibri"/>
-          <w:color w:val="1E293B"/>
-          <w:sz w:val="22"/>
-          <w:szCs w:val="22"/>
-          <w:lang w:val="es-ES"/>
-        </w:rPr>
-        <w:t xml:space="preserve"> 66 fichas adicionales completadas en el día.</w:t>
+        <w:t xml:space="preserve"> Tienen especies pecuarias registradas en la tabla de ganado.</w:t>
       </w:r>
     </w:p>
     <w:p>
@@ -1679,7 +1612,7 @@
           <w:numId w:val="2"/>
         </w:numPr>
         <w:spacing w:before="100" w:beforeAutospacing="1" w:after="100" w:afterAutospacing="1"/>
-        <w:divId w:val="657348125"/>
+        <w:divId w:val="109663700"/>
         <w:rPr>
           <w:rFonts w:ascii="Calibri" w:eastAsia="Times New Roman" w:hAnsi="Calibri" w:cs="Calibri"/>
           <w:color w:val="1E293B"/>
@@ -1690,55 +1623,45 @@
       </w:pPr>
       <w:r>
         <w:rPr>
-          <w:rStyle w:val="Textoennegrita"/>
           <w:rFonts w:ascii="Calibri" w:eastAsia="Times New Roman" w:hAnsi="Calibri" w:cs="Calibri"/>
           <w:color w:val="1E293B"/>
           <w:sz w:val="22"/>
           <w:szCs w:val="22"/>
           <w:lang w:val="es-ES"/>
         </w:rPr>
-        <w:t>Técnica Mayra Lisseth (</w:t>
-      </w:r>
-      <w:r>
-        <w:rPr>
-          <w:rStyle w:val="CdigoHTML"/>
-          <w:b/>
-          <w:bCs/>
-          <w:color w:val="1E293B"/>
-          <w:lang w:val="es-ES"/>
-        </w:rPr>
-        <w:t>mayralisseth201</w:t>
-      </w:r>
-      <w:r>
-        <w:rPr>
-          <w:rStyle w:val="Textoennegrita"/>
+        <w:t xml:space="preserve">Todas poseen la observación: </w:t>
+      </w:r>
+      <w:r>
+        <w:rPr>
+          <w:rStyle w:val="nfasis"/>
           <w:rFonts w:ascii="Calibri" w:eastAsia="Times New Roman" w:hAnsi="Calibri" w:cs="Calibri"/>
           <w:color w:val="1E293B"/>
           <w:sz w:val="22"/>
           <w:szCs w:val="22"/>
           <w:lang w:val="es-ES"/>
         </w:rPr>
-        <w:t>):</w:t>
-      </w:r>
-      <w:r>
-        <w:rPr>
+        <w:t>"PRODUCCIÓN RECUPERADA de investigación de campo (...). Verificar con el rega</w:t>
+      </w:r>
+      <w:r>
+        <w:rPr>
+          <w:rStyle w:val="nfasis"/>
           <w:rFonts w:ascii="Calibri" w:eastAsia="Times New Roman" w:hAnsi="Calibri" w:cs="Calibri"/>
           <w:color w:val="1E293B"/>
           <w:sz w:val="22"/>
           <w:szCs w:val="22"/>
           <w:lang w:val="es-ES"/>
         </w:rPr>
-        <w:t xml:space="preserve"> 34 fichas adicionales completadas en el día.</w:t>
+        <w:t>nte y pasar a Completada."</w:t>
       </w:r>
     </w:p>
     <w:p>
       <w:pPr>
         <w:numPr>
-          <w:ilvl w:val="1"/>
+          <w:ilvl w:val="0"/>
           <w:numId w:val="2"/>
         </w:numPr>
         <w:spacing w:before="100" w:beforeAutospacing="1" w:after="100" w:afterAutospacing="1"/>
-        <w:divId w:val="657348125"/>
+        <w:divId w:val="109663700"/>
         <w:rPr>
           <w:rFonts w:ascii="Calibri" w:eastAsia="Times New Roman" w:hAnsi="Calibri" w:cs="Calibri"/>
           <w:color w:val="1E293B"/>
@@ -1756,38 +1679,28 @@
           <w:szCs w:val="22"/>
           <w:lang w:val="es-ES"/>
         </w:rPr>
-        <w:t>Técnico Editor 5 (</w:t>
-      </w:r>
-      <w:r>
-        <w:rPr>
-          <w:rStyle w:val="CdigoHTML"/>
-          <w:b/>
-          <w:bCs/>
-          <w:color w:val="1E293B"/>
-          <w:lang w:val="es-ES"/>
-        </w:rPr>
-        <w:t>jvk-editor5</w:t>
-      </w:r>
-      <w:r>
-        <w:rPr>
-          <w:rStyle w:val="Textoennegrita"/>
+        <w:t>Estado:</w:t>
+      </w:r>
+      <w:r>
+        <w:rPr>
           <w:rFonts w:ascii="Calibri" w:eastAsia="Times New Roman" w:hAnsi="Calibri" w:cs="Calibri"/>
           <w:color w:val="1E293B"/>
           <w:sz w:val="22"/>
           <w:szCs w:val="22"/>
           <w:lang w:val="es-ES"/>
         </w:rPr>
-        <w:t>):</w:t>
-      </w:r>
-      <w:r>
-        <w:rPr>
+        <w:t xml:space="preserve"> Tienen </w:t>
+      </w:r>
+      <w:r>
+        <w:rPr>
+          <w:rStyle w:val="Textoennegrita"/>
           <w:rFonts w:ascii="Calibri" w:eastAsia="Times New Roman" w:hAnsi="Calibri" w:cs="Calibri"/>
           <w:color w:val="1E293B"/>
           <w:sz w:val="22"/>
           <w:szCs w:val="22"/>
           <w:lang w:val="es-ES"/>
         </w:rPr>
-        <w:t xml:space="preserve"> 24 adici</w:t>
+        <w:t>toda la producción completa</w:t>
       </w:r>
       <w:r>
         <w:rPr>
@@ -1797,17 +1710,17 @@
           <w:szCs w:val="22"/>
           <w:lang w:val="es-ES"/>
         </w:rPr>
-        <w:t>onales + 12 principales (36 totales/día).</w:t>
-      </w:r>
-    </w:p>
-    <w:p>
-      <w:pPr>
-        <w:numPr>
-          <w:ilvl w:val="1"/>
-          <w:numId w:val="2"/>
-        </w:numPr>
-        <w:spacing w:before="100" w:beforeAutospacing="1" w:after="100" w:afterAutospacing="1"/>
-        <w:divId w:val="657348125"/>
+        <w:t xml:space="preserve">, pero 101 están marcadas como </w:t>
+      </w:r>
+      <w:r>
+        <w:rPr>
+          <w:rStyle w:val="CdigoHTML"/>
+          <w:color w:val="1E293B"/>
+          <w:lang w:val="es-ES"/>
+        </w:rPr>
+        <w:t>en_revision</w:t>
+      </w:r>
+      <w:r>
         <w:rPr>
           <w:rFonts w:ascii="Calibri" w:eastAsia="Times New Roman" w:hAnsi="Calibri" w:cs="Calibri"/>
           <w:color w:val="1E293B"/>
@@ -1815,241 +1728,31 @@
           <w:szCs w:val="22"/>
           <w:lang w:val="es-ES"/>
         </w:rPr>
-      </w:pPr>
-      <w:r>
-        <w:rPr>
-          <w:rStyle w:val="Textoennegrita"/>
+        <w:t xml:space="preserve"> y 2 como </w:t>
+      </w:r>
+      <w:r>
+        <w:rPr>
+          <w:rStyle w:val="CdigoHTML"/>
+          <w:color w:val="1E293B"/>
+          <w:lang w:val="es-ES"/>
+        </w:rPr>
+        <w:t>completada</w:t>
+      </w:r>
+      <w:r>
+        <w:rPr>
           <w:rFonts w:ascii="Calibri" w:eastAsia="Times New Roman" w:hAnsi="Calibri" w:cs="Calibri"/>
           <w:color w:val="1E293B"/>
           <w:sz w:val="22"/>
           <w:szCs w:val="22"/>
           <w:lang w:val="es-ES"/>
         </w:rPr>
-        <w:t>Técnico Corp (</w:t>
-      </w:r>
-      <w:r>
-        <w:rPr>
-          <w:rStyle w:val="CdigoHTML"/>
-          <w:b/>
-          <w:bCs/>
-          <w:color w:val="1E293B"/>
-          <w:lang w:val="es-ES"/>
-        </w:rPr>
-        <w:t>jvk-corp</w:t>
-      </w:r>
-      <w:r>
-        <w:rPr>
-          <w:rStyle w:val="Textoennegrita"/>
-          <w:rFonts w:ascii="Calibri" w:eastAsia="Times New Roman" w:hAnsi="Calibri" w:cs="Calibri"/>
-          <w:color w:val="1E293B"/>
-          <w:sz w:val="22"/>
-          <w:szCs w:val="22"/>
-          <w:lang w:val="es-ES"/>
-        </w:rPr>
-        <w:t>):</w:t>
-      </w:r>
-      <w:r>
-        <w:rPr>
-          <w:rFonts w:ascii="Calibri" w:eastAsia="Times New Roman" w:hAnsi="Calibri" w:cs="Calibri"/>
-          <w:color w:val="1E293B"/>
-          <w:sz w:val="22"/>
-          <w:szCs w:val="22"/>
-          <w:lang w:val="es-ES"/>
-        </w:rPr>
-        <w:t xml:space="preserve"> 18 fichas adicionales completadas en el día.</w:t>
-      </w:r>
-    </w:p>
-    <w:p>
-      <w:pPr>
-        <w:numPr>
-          <w:ilvl w:val="1"/>
-          <w:numId w:val="2"/>
-        </w:numPr>
-        <w:spacing w:before="100" w:beforeAutospacing="1" w:after="100" w:afterAutospacing="1"/>
-        <w:divId w:val="657348125"/>
-        <w:rPr>
-          <w:rFonts w:ascii="Calibri" w:eastAsia="Times New Roman" w:hAnsi="Calibri" w:cs="Calibri"/>
-          <w:color w:val="1E293B"/>
-          <w:sz w:val="22"/>
-          <w:szCs w:val="22"/>
-          <w:lang w:val="es-ES"/>
-        </w:rPr>
-      </w:pPr>
-      <w:r>
-        <w:rPr>
-          <w:rStyle w:val="Textoennegrita"/>
-          <w:rFonts w:ascii="Calibri" w:eastAsia="Times New Roman" w:hAnsi="Calibri" w:cs="Calibri"/>
-          <w:color w:val="1E293B"/>
-          <w:sz w:val="22"/>
-          <w:szCs w:val="22"/>
-          <w:lang w:val="es-ES"/>
-        </w:rPr>
-        <w:t>Técnico Editor 1 (</w:t>
-      </w:r>
-      <w:r>
-        <w:rPr>
-          <w:rStyle w:val="CdigoHTML"/>
-          <w:b/>
-          <w:bCs/>
-          <w:color w:val="1E293B"/>
-          <w:lang w:val="es-ES"/>
-        </w:rPr>
-        <w:t>jvk-editor</w:t>
-      </w:r>
-      <w:r>
-        <w:rPr>
-          <w:rStyle w:val="Textoennegrita"/>
-          <w:rFonts w:ascii="Calibri" w:eastAsia="Times New Roman" w:hAnsi="Calibri" w:cs="Calibri"/>
-          <w:color w:val="1E293B"/>
-          <w:sz w:val="22"/>
-          <w:szCs w:val="22"/>
-          <w:lang w:val="es-ES"/>
-        </w:rPr>
-        <w:t>):</w:t>
-      </w:r>
-      <w:r>
-        <w:rPr>
-          <w:rFonts w:ascii="Calibri" w:eastAsia="Times New Roman" w:hAnsi="Calibri" w:cs="Calibri"/>
-          <w:color w:val="1E293B"/>
-          <w:sz w:val="22"/>
-          <w:szCs w:val="22"/>
-          <w:lang w:val="es-ES"/>
-        </w:rPr>
-        <w:t xml:space="preserve"> 7 adicionales + 4 principales (11 totales/día).</w:t>
-      </w:r>
-    </w:p>
-    <w:p>
-      <w:pPr>
-        <w:numPr>
-          <w:ilvl w:val="1"/>
-          <w:numId w:val="2"/>
-        </w:numPr>
-        <w:spacing w:before="100" w:beforeAutospacing="1" w:after="100" w:afterAutospacing="1"/>
-        <w:divId w:val="657348125"/>
-        <w:rPr>
-          <w:rFonts w:ascii="Calibri" w:eastAsia="Times New Roman" w:hAnsi="Calibri" w:cs="Calibri"/>
-          <w:color w:val="1E293B"/>
-          <w:sz w:val="22"/>
-          <w:szCs w:val="22"/>
-          <w:lang w:val="es-ES"/>
-        </w:rPr>
-      </w:pPr>
-      <w:r>
-        <w:rPr>
-          <w:rStyle w:val="Textoennegrita"/>
-          <w:rFonts w:ascii="Calibri" w:eastAsia="Times New Roman" w:hAnsi="Calibri" w:cs="Calibri"/>
-          <w:color w:val="1E293B"/>
-          <w:sz w:val="22"/>
-          <w:szCs w:val="22"/>
-          <w:lang w:val="es-ES"/>
-        </w:rPr>
-        <w:t>Técnico Editor 3 (</w:t>
-      </w:r>
-      <w:r>
-        <w:rPr>
-          <w:rStyle w:val="CdigoHTML"/>
-          <w:b/>
-          <w:bCs/>
-          <w:color w:val="1E293B"/>
-          <w:lang w:val="es-ES"/>
-        </w:rPr>
-        <w:t>jvk-editor3</w:t>
-      </w:r>
-      <w:r>
-        <w:rPr>
-          <w:rStyle w:val="Textoennegrita"/>
-          <w:rFonts w:ascii="Calibri" w:eastAsia="Times New Roman" w:hAnsi="Calibri" w:cs="Calibri"/>
-          <w:color w:val="1E293B"/>
-          <w:sz w:val="22"/>
-          <w:szCs w:val="22"/>
-          <w:lang w:val="es-ES"/>
-        </w:rPr>
-        <w:t>):</w:t>
-      </w:r>
-      <w:r>
-        <w:rPr>
-          <w:rFonts w:ascii="Calibri" w:eastAsia="Times New Roman" w:hAnsi="Calibri" w:cs="Calibri"/>
-          <w:color w:val="1E293B"/>
-          <w:sz w:val="22"/>
-          <w:szCs w:val="22"/>
-          <w:lang w:val="es-ES"/>
-        </w:rPr>
-        <w:t xml:space="preserve"> 5 adicionales + 23 principales (2</w:t>
-      </w:r>
-      <w:r>
-        <w:rPr>
-          <w:rFonts w:ascii="Calibri" w:eastAsia="Times New Roman" w:hAnsi="Calibri" w:cs="Calibri"/>
-          <w:color w:val="1E293B"/>
-          <w:sz w:val="22"/>
-          <w:szCs w:val="22"/>
-          <w:lang w:val="es-ES"/>
-        </w:rPr>
-        <w:t>8 totales/día).</w:t>
-      </w:r>
-    </w:p>
-    <w:p>
-      <w:pPr>
-        <w:numPr>
-          <w:ilvl w:val="1"/>
-          <w:numId w:val="2"/>
-        </w:numPr>
-        <w:spacing w:before="100" w:beforeAutospacing="1" w:after="100" w:afterAutospacing="1"/>
-        <w:divId w:val="657348125"/>
-        <w:rPr>
-          <w:rFonts w:ascii="Calibri" w:eastAsia="Times New Roman" w:hAnsi="Calibri" w:cs="Calibri"/>
-          <w:color w:val="1E293B"/>
-          <w:sz w:val="22"/>
-          <w:szCs w:val="22"/>
-          <w:lang w:val="es-ES"/>
-        </w:rPr>
-      </w:pPr>
-      <w:r>
-        <w:rPr>
-          <w:rStyle w:val="Textoennegrita"/>
-          <w:rFonts w:ascii="Calibri" w:eastAsia="Times New Roman" w:hAnsi="Calibri" w:cs="Calibri"/>
-          <w:color w:val="1E293B"/>
-          <w:sz w:val="22"/>
-          <w:szCs w:val="22"/>
-          <w:lang w:val="es-ES"/>
-        </w:rPr>
-        <w:t>Técnico Editor 2 (</w:t>
-      </w:r>
-      <w:r>
-        <w:rPr>
-          <w:rStyle w:val="CdigoHTML"/>
-          <w:b/>
-          <w:bCs/>
-          <w:color w:val="1E293B"/>
-          <w:lang w:val="es-ES"/>
-        </w:rPr>
-        <w:t>jvk-editor2</w:t>
-      </w:r>
-      <w:r>
-        <w:rPr>
-          <w:rStyle w:val="Textoennegrita"/>
-          <w:rFonts w:ascii="Calibri" w:eastAsia="Times New Roman" w:hAnsi="Calibri" w:cs="Calibri"/>
-          <w:color w:val="1E293B"/>
-          <w:sz w:val="22"/>
-          <w:szCs w:val="22"/>
-          <w:lang w:val="es-ES"/>
-        </w:rPr>
-        <w:t>):</w:t>
-      </w:r>
-      <w:r>
-        <w:rPr>
-          <w:rFonts w:ascii="Calibri" w:eastAsia="Times New Roman" w:hAnsi="Calibri" w:cs="Calibri"/>
-          <w:color w:val="1E293B"/>
-          <w:sz w:val="22"/>
-          <w:szCs w:val="22"/>
-          <w:lang w:val="es-ES"/>
-        </w:rPr>
-        <w:t xml:space="preserve"> 2 fichas adicionales completadas.</w:t>
+        <w:t xml:space="preserve"> para visto bueno técnico.</w:t>
       </w:r>
     </w:p>
     <w:p>
       <w:pPr>
         <w:pStyle w:val="Ttulo2"/>
-        <w:divId w:val="657348125"/>
+        <w:divId w:val="109663700"/>
         <w:rPr>
           <w:rFonts w:ascii="Calibri" w:eastAsia="Times New Roman" w:hAnsi="Calibri" w:cs="Calibri"/>
           <w:lang w:val="es-ES"/>
@@ -2060,7 +1763,7 @@
           <w:rFonts w:ascii="Calibri" w:eastAsia="Times New Roman" w:hAnsi="Calibri" w:cs="Calibri"/>
           <w:lang w:val="es-ES"/>
         </w:rPr>
-        <w:t>3. Tabla Desglosada por Modalidad de Carga (Trabajo del 23 de Julio)</w:t>
+        <w:t>4. Tabla Desglosada por Modalidad de Carga (Trabajo del 23 de Julio)</w:t>
       </w:r>
     </w:p>
     <w:tbl>
@@ -2084,7 +1787,7 @@
       </w:tblGrid>
       <w:tr>
         <w:trPr>
-          <w:divId w:val="657348125"/>
+          <w:divId w:val="109663700"/>
           <w:tblHeader/>
         </w:trPr>
         <w:tc>
@@ -2348,25 +2051,14 @@
                 <w:sz w:val="20"/>
                 <w:szCs w:val="20"/>
               </w:rPr>
-              <w:t>Obs</w:t>
-            </w:r>
-            <w:r>
-              <w:rPr>
-                <w:rFonts w:ascii="Calibri" w:eastAsia="Times New Roman" w:hAnsi="Calibri" w:cs="Calibri"/>
-                <w:b/>
-                <w:bCs/>
-                <w:color w:val="FFFFFF"/>
-                <w:sz w:val="20"/>
-                <w:szCs w:val="20"/>
-              </w:rPr>
-              <w:t>ervaciones del Estado</w:t>
+              <w:t>Observaciones del Estado</w:t>
             </w:r>
           </w:p>
         </w:tc>
       </w:tr>
       <w:tr>
         <w:trPr>
-          <w:divId w:val="657348125"/>
+          <w:divId w:val="109663700"/>
         </w:trPr>
         <w:tc>
           <w:tcPr>
@@ -2617,7 +2309,7 @@
       </w:tr>
       <w:tr>
         <w:trPr>
-          <w:divId w:val="657348125"/>
+          <w:divId w:val="109663700"/>
         </w:trPr>
         <w:tc>
           <w:tcPr>
@@ -2868,7 +2560,7 @@
       </w:tr>
       <w:tr>
         <w:trPr>
-          <w:divId w:val="657348125"/>
+          <w:divId w:val="109663700"/>
         </w:trPr>
         <w:tc>
           <w:tcPr>
@@ -3119,7 +2811,7 @@
       </w:tr>
       <w:tr>
         <w:trPr>
-          <w:divId w:val="657348125"/>
+          <w:divId w:val="109663700"/>
         </w:trPr>
         <w:tc>
           <w:tcPr>
@@ -3370,7 +3062,7 @@
       </w:tr>
       <w:tr>
         <w:trPr>
-          <w:divId w:val="657348125"/>
+          <w:divId w:val="109663700"/>
         </w:trPr>
         <w:tc>
           <w:tcPr>
@@ -3630,7 +3322,7 @@
       </w:tr>
       <w:tr>
         <w:trPr>
-          <w:divId w:val="657348125"/>
+          <w:divId w:val="109663700"/>
         </w:trPr>
         <w:tc>
           <w:tcPr>
@@ -3881,7 +3573,7 @@
       </w:tr>
       <w:tr>
         <w:trPr>
-          <w:divId w:val="657348125"/>
+          <w:divId w:val="109663700"/>
         </w:trPr>
         <w:tc>
           <w:tcPr>
@@ -4132,7 +3824,7 @@
       </w:tr>
       <w:tr>
         <w:trPr>
-          <w:divId w:val="657348125"/>
+          <w:divId w:val="109663700"/>
         </w:trPr>
         <w:tc>
           <w:tcPr>
@@ -4392,7 +4084,7 @@
       </w:tr>
       <w:tr>
         <w:trPr>
-          <w:divId w:val="657348125"/>
+          <w:divId w:val="109663700"/>
         </w:trPr>
         <w:tc>
           <w:tcPr>
@@ -4643,7 +4335,7 @@
       </w:tr>
       <w:tr>
         <w:trPr>
-          <w:divId w:val="657348125"/>
+          <w:divId w:val="109663700"/>
         </w:trPr>
         <w:tc>
           <w:tcPr>
@@ -4916,7 +4608,7 @@
         <w:pStyle w:val="Ttulo2"/>
         <w:spacing w:after="600"/>
         <w:ind w:left="600" w:right="600"/>
-        <w:divId w:val="657348125"/>
+        <w:divId w:val="109663700"/>
         <w:rPr>
           <w:rFonts w:ascii="Calibri" w:eastAsia="Times New Roman" w:hAnsi="Calibri" w:cs="Calibri"/>
           <w:lang w:val="es-ES"/>
@@ -4927,7 +4619,7 @@
           <w:rFonts w:ascii="Calibri" w:eastAsia="Times New Roman" w:hAnsi="Calibri" w:cs="Calibri"/>
           <w:lang w:val="es-ES"/>
         </w:rPr>
-        <w:t>4. Rendimiento Diario Comparativo (22 vs 23 de Julio)</w:t>
+        <w:t>5. Rendimiento Diario Comparativo (22 vs 23 de Julio)</w:t>
       </w:r>
     </w:p>
     <w:tbl>
@@ -4949,7 +4641,7 @@
       </w:tblGrid>
       <w:tr>
         <w:trPr>
-          <w:divId w:val="657348125"/>
+          <w:divId w:val="109663700"/>
           <w:tblHeader/>
         </w:trPr>
         <w:tc>
@@ -5131,7 +4823,7 @@
       </w:tr>
       <w:tr>
         <w:trPr>
-          <w:divId w:val="657348125"/>
+          <w:divId w:val="109663700"/>
         </w:trPr>
         <w:tc>
           <w:tcPr>
@@ -5294,7 +4986,7 @@
       </w:tr>
       <w:tr>
         <w:trPr>
-          <w:divId w:val="657348125"/>
+          <w:divId w:val="109663700"/>
         </w:trPr>
         <w:tc>
           <w:tcPr>
@@ -5457,7 +5149,7 @@
       </w:tr>
       <w:tr>
         <w:trPr>
-          <w:divId w:val="657348125"/>
+          <w:divId w:val="109663700"/>
         </w:trPr>
         <w:tc>
           <w:tcPr>
@@ -5620,7 +5312,7 @@
       </w:tr>
       <w:tr>
         <w:trPr>
-          <w:divId w:val="657348125"/>
+          <w:divId w:val="109663700"/>
         </w:trPr>
         <w:tc>
           <w:tcPr>
@@ -5783,7 +5475,7 @@
       </w:tr>
       <w:tr>
         <w:trPr>
-          <w:divId w:val="657348125"/>
+          <w:divId w:val="109663700"/>
         </w:trPr>
         <w:tc>
           <w:tcPr>
@@ -5946,7 +5638,7 @@
       </w:tr>
       <w:tr>
         <w:trPr>
-          <w:divId w:val="657348125"/>
+          <w:divId w:val="109663700"/>
         </w:trPr>
         <w:tc>
           <w:tcPr>
@@ -6112,7 +5804,7 @@
       <w:pPr>
         <w:pStyle w:val="Ttulo2"/>
         <w:ind w:left="600" w:right="600"/>
-        <w:divId w:val="657348125"/>
+        <w:divId w:val="109663700"/>
         <w:rPr>
           <w:rFonts w:ascii="Calibri" w:eastAsia="Times New Roman" w:hAnsi="Calibri" w:cs="Calibri"/>
           <w:lang w:val="es-ES"/>
@@ -6123,13 +5815,15 @@
           <w:rFonts w:ascii="Calibri" w:eastAsia="Times New Roman" w:hAnsi="Calibri" w:cs="Calibri"/>
           <w:lang w:val="es-ES"/>
         </w:rPr>
-        <w:t>5. Estimación de Tiempos y Planificación de Cierre</w:t>
+        <w:t>6. Estimación de Tiempos y Planificación de Cierre</w:t>
       </w:r>
     </w:p>
     <w:p>
       <w:pPr>
         <w:shd w:val="clear" w:color="auto" w:fill="FEFCE8"/>
-        <w:divId w:val="91631419"/>
+        <w:spacing w:before="240" w:after="240"/>
+        <w:ind w:left="600" w:right="600"/>
+        <w:divId w:val="1361778985"/>
         <w:rPr>
           <w:rFonts w:ascii="Calibri" w:eastAsia="Times New Roman" w:hAnsi="Calibri" w:cs="Calibri"/>
           <w:color w:val="1E293B"/>
@@ -6218,7 +5912,7 @@
       <w:pPr>
         <w:pStyle w:val="Ttulo3"/>
         <w:ind w:left="600" w:right="600"/>
-        <w:divId w:val="657348125"/>
+        <w:divId w:val="109663700"/>
         <w:rPr>
           <w:rFonts w:ascii="Calibri" w:eastAsia="Times New Roman" w:hAnsi="Calibri" w:cs="Calibri"/>
           <w:lang w:val="es-ES"/>
@@ -6229,13 +5923,14 @@
           <w:rFonts w:ascii="Calibri" w:eastAsia="Times New Roman" w:hAnsi="Calibri" w:cs="Calibri"/>
           <w:lang w:val="es-ES"/>
         </w:rPr>
-        <w:t>Proyección de Cierre de Trabajo de Campo:</w:t>
+        <w:t>Proyección Real de Cierre de Trabajo de Campo:</w:t>
       </w:r>
     </w:p>
     <w:p>
       <w:pPr>
         <w:pStyle w:val="NormalWeb"/>
-        <w:divId w:val="657348125"/>
+        <w:ind w:left="600" w:right="600"/>
+        <w:divId w:val="109663700"/>
         <w:rPr>
           <w:rFonts w:ascii="Calibri" w:hAnsi="Calibri" w:cs="Calibri"/>
           <w:color w:val="1E293B"/>
@@ -6248,7 +5943,7 @@
           <w:color w:val="1E293B"/>
           <w:lang w:val="es-ES"/>
         </w:rPr>
-        <w:t>Descontando la inyección por script y considerando el ritmo real de la fuerza de campo (</w:t>
+        <w:t>Descontando la inyección automatizada por script y considerando únicamente el ritmo real de campo de la fuerza de terreno (</w:t>
       </w:r>
       <w:r>
         <w:rPr>
@@ -6273,7 +5968,7 @@
         <w:pStyle w:val="NormalWeb"/>
         <w:ind w:left="600" w:right="600"/>
         <w:jc w:val="center"/>
-        <w:divId w:val="657348125"/>
+        <w:divId w:val="109663700"/>
         <w:rPr>
           <w:rFonts w:ascii="Calibri" w:hAnsi="Calibri" w:cs="Calibri"/>
           <w:b/>
@@ -6294,14 +5989,26 @@
           <w:szCs w:val="26"/>
           <w:lang w:val="es-ES"/>
         </w:rPr>
-        <w:t xml:space="preserve">Tiempo de Cierre Restante = 1,843 fichas pendientes / 275 fichas reales/día = 6.7 Días Laborables </w:t>
+        <w:t xml:space="preserve">Tiempo Real de Cierre Restante = </w:t>
+      </w:r>
+      <w:r>
+        <w:rPr>
+          <w:rFonts w:ascii="Calibri" w:hAnsi="Calibri" w:cs="Calibri"/>
+          <w:b/>
+          <w:bCs/>
+          <w:color w:val="0284C7"/>
+          <w:sz w:val="26"/>
+          <w:szCs w:val="26"/>
+          <w:lang w:val="es-ES"/>
+        </w:rPr>
+        <w:t xml:space="preserve">1,843 fichas pendientes / 275 fichas reales/día = 6.7 Días Laborables </w:t>
       </w:r>
     </w:p>
     <w:p>
       <w:pPr>
         <w:pStyle w:val="NormalWeb"/>
         <w:ind w:left="600" w:right="600"/>
-        <w:divId w:val="657348125"/>
+        <w:divId w:val="109663700"/>
         <w:rPr>
           <w:rFonts w:ascii="Calibri" w:hAnsi="Calibri" w:cs="Calibri"/>
           <w:color w:val="1E293B"/>
@@ -6332,7 +6039,7 @@
           <w:color w:val="1E293B"/>
           <w:lang w:val="es-ES"/>
         </w:rPr>
-        <w:t xml:space="preserve">100% </w:t>
+        <w:t>100% investigado y cerrado en apr</w:t>
       </w:r>
       <w:r>
         <w:rPr>
@@ -6341,7 +6048,7 @@
           <w:color w:val="1E293B"/>
           <w:lang w:val="es-ES"/>
         </w:rPr>
-        <w:t>investigado y cerrado en campo en aproximadamente 6 a 7 días de trabajo</w:t>
+        <w:t>oximadamente 6 a 7 días de trabajo</w:t>
       </w:r>
       <w:r>
         <w:rPr>
@@ -6357,7 +6064,7 @@
         <w:spacing w:before="600" w:after="600"/>
         <w:ind w:left="600" w:right="600"/>
         <w:jc w:val="center"/>
-        <w:divId w:val="173569383"/>
+        <w:divId w:val="1146161660"/>
         <w:rPr>
           <w:rFonts w:ascii="Calibri" w:eastAsia="Times New Roman" w:hAnsi="Calibri" w:cs="Calibri"/>
           <w:color w:val="64748B"/>
@@ -6401,9 +6108,9 @@
 <file path=word/numbering.xml><?xml version="1.0" encoding="utf-8"?>
 <w:numbering xmlns:wpc="http://schemas.microsoft.com/office/word/2010/wordprocessingCanvas" xmlns:cx="http://schemas.microsoft.com/office/drawing/2014/chartex" xmlns:cx1="http://schemas.microsoft.com/office/drawing/2015/9/8/chartex" xmlns:cx2="http://schemas.microsoft.com/office/drawing/2015/10/21/chartex" xmlns:cx3="http://schemas.microsoft.com/office/drawing/2016/5/9/chartex" xmlns:cx4="http://schemas.microsoft.com/office/drawing/2016/5/10/chartex" xmlns:cx5="http://schemas.microsoft.com/office/drawing/2016/5/11/chartex" xmlns:cx6="http://schemas.microsoft.com/office/drawing/2016/5/12/chartex" xmlns:cx7="http://schemas.microsoft.com/office/drawing/2016/5/13/chartex" xmlns:cx8="http://schemas.microsoft.com/office/drawing/2016/5/14/chartex" xmlns:mc="http://schemas.openxmlformats.org/markup-compatibility/2006" xmlns:aink="http://schemas.microsoft.com/office/drawing/2016/ink" xmlns:am3d="http://schemas.microsoft.com/office/drawing/2017/model3d" xmlns:o="urn:schemas-microsoft-com:office:office" xmlns:r="http://schemas.openxmlformats.org/officeDocument/2006/relationships" xmlns:m="http://schemas.openxmlformats.org/officeDocument/2006/math" xmlns:v="urn:schemas-microsoft-com:vml" xmlns:wp14="http://schemas.microsoft.com/office/word/2010/wordprocessingDrawing" xmlns:wp="http://schemas.openxmlformats.org/drawingml/2006/wordprocessingDrawing" xmlns:w10="urn:schemas-microsoft-com:office:word" xmlns:w="http://schemas.openxmlformats.org/wordprocessingml/2006/main" xmlns:w14="http://schemas.microsoft.com/office/word/2010/wordml" xmlns:w15="http://schemas.microsoft.com/office/word/2012/wordml" xmlns:w16cex="http://schemas.microsoft.com/office/word/2018/wordml/cex" xmlns:w16cid="http://schemas.microsoft.com/office/word/2016/wordml/cid" xmlns:w16="http://schemas.microsoft.com/office/word/2018/wordml" xmlns:w16sdtdh="http://schemas.microsoft.com/office/word/2020/wordml/sdtdatahash" xmlns:w16se="http://schemas.microsoft.com/office/word/2015/wordml/symex" xmlns:wpg="http://schemas.microsoft.com/office/word/2010/wordprocessingGroup" xmlns:wpi="http://schemas.microsoft.com/office/word/2010/wordprocessingInk" xmlns:wne="http://schemas.microsoft.com/office/word/2006/wordml" xmlns:wps="http://schemas.microsoft.com/office/word/2010/wordprocessingShape" mc:Ignorable="w14 w15 w16se w16cid w16 w16cex w16sdtdh wp14">
   <w:abstractNum w:abstractNumId="0" w15:restartNumberingAfterBreak="0">
-    <w:nsid w:val="01D32B96"/>
+    <w:nsid w:val="2F5D4012"/>
     <w:multiLevelType w:val="multilevel"/>
-    <w:tmpl w:val="90184A1E"/>
+    <w:tmpl w:val="82A8FFDE"/>
     <w:lvl w:ilvl="0">
       <w:start w:val="1"/>
       <w:numFmt w:val="bullet"/>
@@ -6420,7 +6127,7 @@
         <w:sz w:val="20"/>
       </w:rPr>
     </w:lvl>
-    <w:lvl w:ilvl="1">
+    <w:lvl w:ilvl="1" w:tentative="1">
       <w:start w:val="1"/>
       <w:numFmt w:val="bullet"/>
       <w:lvlText w:val="o"/>
@@ -6550,9 +6257,9 @@
     </w:lvl>
   </w:abstractNum>
   <w:abstractNum w:abstractNumId="1" w15:restartNumberingAfterBreak="0">
-    <w:nsid w:val="5D1C3234"/>
+    <w:nsid w:val="420903B2"/>
     <w:multiLevelType w:val="multilevel"/>
-    <w:tmpl w:val="71BEE986"/>
+    <w:tmpl w:val="FA16CEFC"/>
     <w:lvl w:ilvl="0">
       <w:start w:val="1"/>
       <w:numFmt w:val="bullet"/>
@@ -7341,6 +7048,21 @@
       <w:szCs w:val="21"/>
     </w:rPr>
   </w:style>
+  <w:style w:type="paragraph" w:customStyle="1" w:styleId="info-box">
+    <w:name w:val="info-box"/>
+    <w:basedOn w:val="Normal"/>
+    <w:pPr>
+      <w:pBdr>
+        <w:left w:val="single" w:sz="24" w:space="9" w:color="16A34A"/>
+      </w:pBdr>
+      <w:shd w:val="clear" w:color="auto" w:fill="F0FDF4"/>
+      <w:spacing w:before="240" w:after="240"/>
+    </w:pPr>
+    <w:rPr>
+      <w:sz w:val="21"/>
+      <w:szCs w:val="21"/>
+    </w:rPr>
+  </w:style>
   <w:style w:type="paragraph" w:customStyle="1" w:styleId="footer">
     <w:name w:val="footer"/>
     <w:basedOn w:val="Normal"/>
@@ -7385,18 +7107,6 @@
       <w:color w:val="B45309"/>
     </w:rPr>
   </w:style>
-  <w:style w:type="character" w:styleId="CdigoHTML">
-    <w:name w:val="HTML Code"/>
-    <w:basedOn w:val="Fuentedeprrafopredeter"/>
-    <w:uiPriority w:val="99"/>
-    <w:semiHidden/>
-    <w:unhideWhenUsed/>
-    <w:rPr>
-      <w:rFonts w:ascii="Courier New" w:eastAsiaTheme="minorEastAsia" w:hAnsi="Courier New" w:cs="Courier New"/>
-      <w:sz w:val="20"/>
-      <w:szCs w:val="20"/>
-    </w:rPr>
-  </w:style>
   <w:style w:type="character" w:customStyle="1" w:styleId="badge-info1">
     <w:name w:val="badge-info1"/>
     <w:basedOn w:val="Fuentedeprrafopredeter"/>
@@ -7414,6 +7124,18 @@
     <w:rPr>
       <w:i/>
       <w:iCs/>
+    </w:rPr>
+  </w:style>
+  <w:style w:type="character" w:styleId="CdigoHTML">
+    <w:name w:val="HTML Code"/>
+    <w:basedOn w:val="Fuentedeprrafopredeter"/>
+    <w:uiPriority w:val="99"/>
+    <w:semiHidden/>
+    <w:unhideWhenUsed/>
+    <w:rPr>
+      <w:rFonts w:ascii="Courier New" w:eastAsiaTheme="minorEastAsia" w:hAnsi="Courier New" w:cs="Courier New"/>
+      <w:sz w:val="20"/>
+      <w:szCs w:val="20"/>
     </w:rPr>
   </w:style>
 </w:styles>

</xml_diff>

<commit_message>
docs: actualizar informe Word con nombres mapeados de los técnicos de campo
</commit_message>
<xml_diff>
--- a/public/informe_avance_personal_fichas_adicionales.docx
+++ b/public/informe_avance_personal_fichas_adicionales.docx
@@ -5,7 +5,7 @@
     <w:p>
       <w:pPr>
         <w:shd w:val="clear" w:color="auto" w:fill="F0F9FF"/>
-        <w:divId w:val="811486768"/>
+        <w:divId w:val="1848132480"/>
         <w:rPr>
           <w:rFonts w:ascii="Calibri" w:eastAsia="Times New Roman" w:hAnsi="Calibri" w:cs="Calibri"/>
           <w:b/>
@@ -28,7 +28,7 @@
     <w:p>
       <w:pPr>
         <w:shd w:val="clear" w:color="auto" w:fill="F0F9FF"/>
-        <w:divId w:val="437918672"/>
+        <w:divId w:val="386993951"/>
         <w:rPr>
           <w:rFonts w:ascii="Calibri" w:eastAsia="Times New Roman" w:hAnsi="Calibri" w:cs="Calibri"/>
           <w:color w:val="1E293B"/>
@@ -56,7 +56,7 @@
     <w:p>
       <w:pPr>
         <w:shd w:val="clear" w:color="auto" w:fill="F0F9FF"/>
-        <w:divId w:val="340669340"/>
+        <w:divId w:val="699554102"/>
         <w:rPr>
           <w:rFonts w:ascii="Calibri" w:eastAsia="Times New Roman" w:hAnsi="Calibri" w:cs="Calibri"/>
           <w:color w:val="1E293B"/>
@@ -92,7 +92,7 @@
     <w:p>
       <w:pPr>
         <w:shd w:val="clear" w:color="auto" w:fill="F0F9FF"/>
-        <w:divId w:val="1833791430"/>
+        <w:divId w:val="2122530693"/>
         <w:rPr>
           <w:rFonts w:ascii="Calibri" w:eastAsia="Times New Roman" w:hAnsi="Calibri" w:cs="Calibri"/>
           <w:color w:val="1E293B"/>
@@ -120,7 +120,7 @@
     <w:p>
       <w:pPr>
         <w:pStyle w:val="Ttulo1"/>
-        <w:divId w:val="109663700"/>
+        <w:divId w:val="441268612"/>
         <w:rPr>
           <w:rFonts w:ascii="Calibri" w:eastAsia="Times New Roman" w:hAnsi="Calibri" w:cs="Calibri"/>
           <w:lang w:val="es-ES"/>
@@ -137,7 +137,7 @@
     <w:p>
       <w:pPr>
         <w:pStyle w:val="Ttulo2"/>
-        <w:divId w:val="109663700"/>
+        <w:divId w:val="441268612"/>
         <w:rPr>
           <w:rFonts w:ascii="Calibri" w:eastAsia="Times New Roman" w:hAnsi="Calibri" w:cs="Calibri"/>
           <w:lang w:val="es-ES"/>
@@ -154,7 +154,7 @@
     <w:p>
       <w:pPr>
         <w:pStyle w:val="NormalWeb"/>
-        <w:divId w:val="109663700"/>
+        <w:divId w:val="441268612"/>
         <w:rPr>
           <w:rFonts w:ascii="Calibri" w:hAnsi="Calibri" w:cs="Calibri"/>
           <w:color w:val="1E293B"/>
@@ -214,7 +214,7 @@
       </w:tblGrid>
       <w:tr>
         <w:trPr>
-          <w:divId w:val="109663700"/>
+          <w:divId w:val="441268612"/>
           <w:tblHeader/>
         </w:trPr>
         <w:tc>
@@ -407,7 +407,7 @@
       </w:tr>
       <w:tr>
         <w:trPr>
-          <w:divId w:val="109663700"/>
+          <w:divId w:val="441268612"/>
         </w:trPr>
         <w:tc>
           <w:tcPr>
@@ -569,7 +569,7 @@
       </w:tr>
       <w:tr>
         <w:trPr>
-          <w:divId w:val="109663700"/>
+          <w:divId w:val="441268612"/>
         </w:trPr>
         <w:tc>
           <w:tcPr>
@@ -731,7 +731,7 @@
       </w:tr>
       <w:tr>
         <w:trPr>
-          <w:divId w:val="109663700"/>
+          <w:divId w:val="441268612"/>
         </w:trPr>
         <w:tc>
           <w:tcPr>
@@ -893,7 +893,7 @@
       </w:tr>
       <w:tr>
         <w:trPr>
-          <w:divId w:val="109663700"/>
+          <w:divId w:val="441268612"/>
         </w:trPr>
         <w:tc>
           <w:tcPr>
@@ -1076,7 +1076,7 @@
     <w:p>
       <w:pPr>
         <w:pStyle w:val="Ttulo2"/>
-        <w:divId w:val="109663700"/>
+        <w:divId w:val="441268612"/>
         <w:rPr>
           <w:rFonts w:ascii="Calibri" w:eastAsia="Times New Roman" w:hAnsi="Calibri" w:cs="Calibri"/>
           <w:lang w:val="es-ES"/>
@@ -1093,7 +1093,7 @@
     <w:p>
       <w:pPr>
         <w:shd w:val="clear" w:color="auto" w:fill="F0FDF4"/>
-        <w:divId w:val="1494371485"/>
+        <w:divId w:val="1472284042"/>
         <w:rPr>
           <w:rFonts w:ascii="Calibri" w:eastAsia="Times New Roman" w:hAnsi="Calibri" w:cs="Calibri"/>
           <w:color w:val="1E293B"/>
@@ -1131,7 +1131,7 @@
           <w:numId w:val="1"/>
         </w:numPr>
         <w:spacing w:before="100" w:beforeAutospacing="1" w:after="100" w:afterAutospacing="1"/>
-        <w:divId w:val="109663700"/>
+        <w:divId w:val="441268612"/>
         <w:rPr>
           <w:rFonts w:ascii="Calibri" w:eastAsia="Times New Roman" w:hAnsi="Calibri" w:cs="Calibri"/>
           <w:color w:val="1E293B"/>
@@ -1191,7 +1191,7 @@
           <w:numId w:val="1"/>
         </w:numPr>
         <w:spacing w:before="100" w:beforeAutospacing="1" w:after="100" w:afterAutospacing="1"/>
-        <w:divId w:val="109663700"/>
+        <w:divId w:val="441268612"/>
         <w:rPr>
           <w:rFonts w:ascii="Calibri" w:eastAsia="Times New Roman" w:hAnsi="Calibri" w:cs="Calibri"/>
           <w:color w:val="1E293B"/>
@@ -1349,7 +1349,7 @@
           <w:numId w:val="1"/>
         </w:numPr>
         <w:spacing w:before="100" w:beforeAutospacing="1" w:after="100" w:afterAutospacing="1"/>
-        <w:divId w:val="109663700"/>
+        <w:divId w:val="441268612"/>
         <w:rPr>
           <w:rFonts w:ascii="Calibri" w:eastAsia="Times New Roman" w:hAnsi="Calibri" w:cs="Calibri"/>
           <w:color w:val="1E293B"/>
@@ -1405,7 +1405,7 @@
     <w:p>
       <w:pPr>
         <w:pStyle w:val="Ttulo2"/>
-        <w:divId w:val="109663700"/>
+        <w:divId w:val="441268612"/>
         <w:rPr>
           <w:rFonts w:ascii="Calibri" w:eastAsia="Times New Roman" w:hAnsi="Calibri" w:cs="Calibri"/>
           <w:lang w:val="es-ES"/>
@@ -1416,21 +1416,7 @@
           <w:rFonts w:ascii="Calibri" w:eastAsia="Times New Roman" w:hAnsi="Calibri" w:cs="Calibri"/>
           <w:lang w:val="es-ES"/>
         </w:rPr>
-        <w:t xml:space="preserve">3. Auditoría de Carga Automatizada — Usuario </w:t>
-      </w:r>
-      <w:r>
-        <w:rPr>
-          <w:rStyle w:val="CdigoHTML"/>
-          <w:lang w:val="es-ES"/>
-        </w:rPr>
-        <w:t>jvk-digitalizacion</w:t>
-      </w:r>
-      <w:r>
-        <w:rPr>
-          <w:rFonts w:ascii="Calibri" w:eastAsia="Times New Roman" w:hAnsi="Calibri" w:cs="Calibri"/>
-          <w:lang w:val="es-ES"/>
-        </w:rPr>
-        <w:t xml:space="preserve"> (103 Fichas)</w:t>
+        <w:t>3. Auditoría de Carga Automatizada — Usuario JVK-DIGITALIZACION (103 Fichas)</w:t>
       </w:r>
     </w:p>
     <w:p>
@@ -1440,7 +1426,7 @@
           <w:numId w:val="2"/>
         </w:numPr>
         <w:spacing w:before="100" w:beforeAutospacing="1" w:after="100" w:afterAutospacing="1"/>
-        <w:divId w:val="109663700"/>
+        <w:divId w:val="441268612"/>
         <w:rPr>
           <w:rFonts w:ascii="Calibri" w:eastAsia="Times New Roman" w:hAnsi="Calibri" w:cs="Calibri"/>
           <w:color w:val="1E293B"/>
@@ -1488,7 +1474,7 @@
           <w:numId w:val="2"/>
         </w:numPr>
         <w:spacing w:before="100" w:beforeAutospacing="1" w:after="100" w:afterAutospacing="1"/>
-        <w:divId w:val="109663700"/>
+        <w:divId w:val="441268612"/>
         <w:rPr>
           <w:rFonts w:ascii="Calibri" w:eastAsia="Times New Roman" w:hAnsi="Calibri" w:cs="Calibri"/>
           <w:color w:val="1E293B"/>
@@ -1526,7 +1512,7 @@
           <w:numId w:val="2"/>
         </w:numPr>
         <w:spacing w:before="100" w:beforeAutospacing="1" w:after="100" w:afterAutospacing="1"/>
-        <w:divId w:val="109663700"/>
+        <w:divId w:val="441268612"/>
         <w:rPr>
           <w:rFonts w:ascii="Calibri" w:eastAsia="Times New Roman" w:hAnsi="Calibri" w:cs="Calibri"/>
           <w:color w:val="1E293B"/>
@@ -1574,7 +1560,7 @@
           <w:numId w:val="2"/>
         </w:numPr>
         <w:spacing w:before="100" w:beforeAutospacing="1" w:after="100" w:afterAutospacing="1"/>
-        <w:divId w:val="109663700"/>
+        <w:divId w:val="441268612"/>
         <w:rPr>
           <w:rFonts w:ascii="Calibri" w:eastAsia="Times New Roman" w:hAnsi="Calibri" w:cs="Calibri"/>
           <w:color w:val="1E293B"/>
@@ -1612,7 +1598,7 @@
           <w:numId w:val="2"/>
         </w:numPr>
         <w:spacing w:before="100" w:beforeAutospacing="1" w:after="100" w:afterAutospacing="1"/>
-        <w:divId w:val="109663700"/>
+        <w:divId w:val="441268612"/>
         <w:rPr>
           <w:rFonts w:ascii="Calibri" w:eastAsia="Times New Roman" w:hAnsi="Calibri" w:cs="Calibri"/>
           <w:color w:val="1E293B"/>
@@ -1661,7 +1647,7 @@
           <w:numId w:val="2"/>
         </w:numPr>
         <w:spacing w:before="100" w:beforeAutospacing="1" w:after="100" w:afterAutospacing="1"/>
-        <w:divId w:val="109663700"/>
+        <w:divId w:val="441268612"/>
         <w:rPr>
           <w:rFonts w:ascii="Calibri" w:eastAsia="Times New Roman" w:hAnsi="Calibri" w:cs="Calibri"/>
           <w:color w:val="1E293B"/>
@@ -1752,7 +1738,7 @@
     <w:p>
       <w:pPr>
         <w:pStyle w:val="Ttulo2"/>
-        <w:divId w:val="109663700"/>
+        <w:divId w:val="441268612"/>
         <w:rPr>
           <w:rFonts w:ascii="Calibri" w:eastAsia="Times New Roman" w:hAnsi="Calibri" w:cs="Calibri"/>
           <w:lang w:val="es-ES"/>
@@ -1763,7 +1749,7 @@
           <w:rFonts w:ascii="Calibri" w:eastAsia="Times New Roman" w:hAnsi="Calibri" w:cs="Calibri"/>
           <w:lang w:val="es-ES"/>
         </w:rPr>
-        <w:t>4. Tabla Desglosada por Modalidad de Carga (Trabajo del 23 de Julio)</w:t>
+        <w:t>4. Tabla Desglosada por Técnico Investigador (Trabajo del 23 de Julio)</w:t>
       </w:r>
     </w:p>
     <w:tbl>
@@ -1778,16 +1764,17 @@
         <w:tblLook w:val="04A0" w:firstRow="1" w:lastRow="0" w:firstColumn="1" w:lastColumn="0" w:noHBand="0" w:noVBand="1"/>
       </w:tblPr>
       <w:tblGrid>
-        <w:gridCol w:w="1755"/>
-        <w:gridCol w:w="1274"/>
-        <w:gridCol w:w="1324"/>
-        <w:gridCol w:w="1273"/>
-        <w:gridCol w:w="1232"/>
-        <w:gridCol w:w="1630"/>
+        <w:gridCol w:w="1472"/>
+        <w:gridCol w:w="2161"/>
+        <w:gridCol w:w="1260"/>
+        <w:gridCol w:w="1314"/>
+        <w:gridCol w:w="1263"/>
+        <w:gridCol w:w="1223"/>
+        <w:gridCol w:w="1576"/>
       </w:tblGrid>
       <w:tr>
         <w:trPr>
-          <w:divId w:val="109663700"/>
+          <w:divId w:val="441268612"/>
           <w:tblHeader/>
         </w:trPr>
         <w:tc>
@@ -1831,7 +1818,7 @@
                 <w:szCs w:val="20"/>
               </w:rPr>
               <w:lastRenderedPageBreak/>
-              <w:t>Técnico / Usuario Registrado</w:t>
+              <w:t>Técnico Investigador</w:t>
             </w:r>
           </w:p>
         </w:tc>
@@ -1875,7 +1862,18 @@
                 <w:sz w:val="20"/>
                 <w:szCs w:val="20"/>
               </w:rPr>
-              <w:t>Modalidad de Carga</w:t>
+              <w:t>Usuari</w:t>
+            </w:r>
+            <w:r>
+              <w:rPr>
+                <w:rFonts w:ascii="Calibri" w:eastAsia="Times New Roman" w:hAnsi="Calibri" w:cs="Calibri"/>
+                <w:b/>
+                <w:bCs/>
+                <w:color w:val="FFFFFF"/>
+                <w:sz w:val="20"/>
+                <w:szCs w:val="20"/>
+              </w:rPr>
+              <w:t>o QField</w:t>
             </w:r>
           </w:p>
         </w:tc>
@@ -1919,7 +1917,7 @@
                 <w:sz w:val="20"/>
                 <w:szCs w:val="20"/>
               </w:rPr>
-              <w:t>Fichas Adicionales</w:t>
+              <w:t>Modalidad de Carga</w:t>
             </w:r>
           </w:p>
         </w:tc>
@@ -1963,7 +1961,7 @@
                 <w:sz w:val="20"/>
                 <w:szCs w:val="20"/>
               </w:rPr>
-              <w:t>Fichas Principales</w:t>
+              <w:t>Fichas Adicionales</w:t>
             </w:r>
           </w:p>
         </w:tc>
@@ -2007,7 +2005,7 @@
                 <w:sz w:val="20"/>
                 <w:szCs w:val="20"/>
               </w:rPr>
-              <w:t>Total Procesado</w:t>
+              <w:t>Fichas Principales</w:t>
             </w:r>
           </w:p>
         </w:tc>
@@ -2051,6 +2049,50 @@
                 <w:sz w:val="20"/>
                 <w:szCs w:val="20"/>
               </w:rPr>
+              <w:t>Total Procesado</w:t>
+            </w:r>
+          </w:p>
+        </w:tc>
+        <w:tc>
+          <w:tcPr>
+            <w:tcW w:w="0" w:type="auto"/>
+            <w:tcBorders>
+              <w:top w:val="single" w:sz="6" w:space="0" w:color="0F172A"/>
+              <w:left w:val="single" w:sz="6" w:space="0" w:color="0F172A"/>
+              <w:bottom w:val="single" w:sz="6" w:space="0" w:color="0F172A"/>
+              <w:right w:val="single" w:sz="6" w:space="0" w:color="0F172A"/>
+            </w:tcBorders>
+            <w:shd w:val="clear" w:color="auto" w:fill="0F172A"/>
+            <w:tcMar>
+              <w:top w:w="120" w:type="dxa"/>
+              <w:left w:w="180" w:type="dxa"/>
+              <w:bottom w:w="120" w:type="dxa"/>
+              <w:right w:w="180" w:type="dxa"/>
+            </w:tcMar>
+            <w:vAlign w:val="center"/>
+            <w:hideMark/>
+          </w:tcPr>
+          <w:p>
+            <w:pPr>
+              <w:spacing w:before="180" w:after="300"/>
+              <w:rPr>
+                <w:rFonts w:ascii="Calibri" w:eastAsia="Times New Roman" w:hAnsi="Calibri" w:cs="Calibri"/>
+                <w:b/>
+                <w:bCs/>
+                <w:color w:val="FFFFFF"/>
+                <w:sz w:val="20"/>
+                <w:szCs w:val="20"/>
+              </w:rPr>
+            </w:pPr>
+            <w:r>
+              <w:rPr>
+                <w:rFonts w:ascii="Calibri" w:eastAsia="Times New Roman" w:hAnsi="Calibri" w:cs="Calibri"/>
+                <w:b/>
+                <w:bCs/>
+                <w:color w:val="FFFFFF"/>
+                <w:sz w:val="20"/>
+                <w:szCs w:val="20"/>
+              </w:rPr>
               <w:t>Observaciones del Estado</w:t>
             </w:r>
           </w:p>
@@ -2058,7 +2100,7 @@
       </w:tr>
       <w:tr>
         <w:trPr>
-          <w:divId w:val="109663700"/>
+          <w:divId w:val="441268612"/>
         </w:trPr>
         <w:tc>
           <w:tcPr>
@@ -2096,16 +2138,44 @@
                 <w:sz w:val="20"/>
                 <w:szCs w:val="20"/>
               </w:rPr>
+              <w:t>Adriana Cuascota</w:t>
+            </w:r>
+          </w:p>
+        </w:tc>
+        <w:tc>
+          <w:tcPr>
+            <w:tcW w:w="0" w:type="auto"/>
+            <w:tcBorders>
+              <w:top w:val="single" w:sz="6" w:space="0" w:color="CBD5E1"/>
+              <w:left w:val="single" w:sz="6" w:space="0" w:color="CBD5E1"/>
+              <w:bottom w:val="single" w:sz="6" w:space="0" w:color="CBD5E1"/>
+              <w:right w:val="single" w:sz="6" w:space="0" w:color="CBD5E1"/>
+            </w:tcBorders>
+            <w:tcMar>
+              <w:top w:w="105" w:type="dxa"/>
+              <w:left w:w="180" w:type="dxa"/>
+              <w:bottom w:w="105" w:type="dxa"/>
+              <w:right w:w="180" w:type="dxa"/>
+            </w:tcMar>
+            <w:vAlign w:val="center"/>
+            <w:hideMark/>
+          </w:tcPr>
+          <w:p>
+            <w:pPr>
+              <w:spacing w:before="180" w:after="300"/>
+              <w:rPr>
+                <w:rFonts w:ascii="Calibri" w:eastAsia="Times New Roman" w:hAnsi="Calibri" w:cs="Calibri"/>
+                <w:color w:val="1E293B"/>
+                <w:sz w:val="20"/>
+                <w:szCs w:val="20"/>
+              </w:rPr>
+            </w:pPr>
+            <w:r>
+              <w:rPr>
+                <w:rStyle w:val="CdigoHTML"/>
+                <w:color w:val="1E293B"/>
+              </w:rPr>
               <w:t>jvk-editor6</w:t>
-            </w:r>
-            <w:r>
-              <w:rPr>
-                <w:rFonts w:ascii="Calibri" w:eastAsia="Times New Roman" w:hAnsi="Calibri" w:cs="Calibri"/>
-                <w:color w:val="1E293B"/>
-                <w:sz w:val="20"/>
-                <w:szCs w:val="20"/>
-              </w:rPr>
-              <w:t xml:space="preserve"> (Técnico Editor 6)</w:t>
             </w:r>
           </w:p>
         </w:tc>
@@ -2309,7 +2379,7 @@
       </w:tr>
       <w:tr>
         <w:trPr>
-          <w:divId w:val="109663700"/>
+          <w:divId w:val="441268612"/>
         </w:trPr>
         <w:tc>
           <w:tcPr>
@@ -2347,16 +2417,44 @@
                 <w:sz w:val="20"/>
                 <w:szCs w:val="20"/>
               </w:rPr>
+              <w:t>JVK Digitalización</w:t>
+            </w:r>
+          </w:p>
+        </w:tc>
+        <w:tc>
+          <w:tcPr>
+            <w:tcW w:w="0" w:type="auto"/>
+            <w:tcBorders>
+              <w:top w:val="single" w:sz="6" w:space="0" w:color="CBD5E1"/>
+              <w:left w:val="single" w:sz="6" w:space="0" w:color="CBD5E1"/>
+              <w:bottom w:val="single" w:sz="6" w:space="0" w:color="CBD5E1"/>
+              <w:right w:val="single" w:sz="6" w:space="0" w:color="CBD5E1"/>
+            </w:tcBorders>
+            <w:tcMar>
+              <w:top w:w="105" w:type="dxa"/>
+              <w:left w:w="180" w:type="dxa"/>
+              <w:bottom w:w="105" w:type="dxa"/>
+              <w:right w:w="180" w:type="dxa"/>
+            </w:tcMar>
+            <w:vAlign w:val="center"/>
+            <w:hideMark/>
+          </w:tcPr>
+          <w:p>
+            <w:pPr>
+              <w:spacing w:before="180" w:after="300"/>
+              <w:rPr>
+                <w:rFonts w:ascii="Calibri" w:eastAsia="Times New Roman" w:hAnsi="Calibri" w:cs="Calibri"/>
+                <w:color w:val="1E293B"/>
+                <w:sz w:val="20"/>
+                <w:szCs w:val="20"/>
+              </w:rPr>
+            </w:pPr>
+            <w:r>
+              <w:rPr>
+                <w:rStyle w:val="CdigoHTML"/>
+                <w:color w:val="1E293B"/>
+              </w:rPr>
               <w:t>jvk-digitalizacion</w:t>
-            </w:r>
-            <w:r>
-              <w:rPr>
-                <w:rFonts w:ascii="Calibri" w:eastAsia="Times New Roman" w:hAnsi="Calibri" w:cs="Calibri"/>
-                <w:color w:val="1E293B"/>
-                <w:sz w:val="20"/>
-                <w:szCs w:val="20"/>
-              </w:rPr>
-              <w:t xml:space="preserve"> (Script)</w:t>
             </w:r>
           </w:p>
         </w:tc>
@@ -2560,7 +2658,7 @@
       </w:tr>
       <w:tr>
         <w:trPr>
-          <w:divId w:val="109663700"/>
+          <w:divId w:val="441268612"/>
         </w:trPr>
         <w:tc>
           <w:tcPr>
@@ -2598,16 +2696,44 @@
                 <w:sz w:val="20"/>
                 <w:szCs w:val="20"/>
               </w:rPr>
+              <w:t>Martha Simbaña</w:t>
+            </w:r>
+          </w:p>
+        </w:tc>
+        <w:tc>
+          <w:tcPr>
+            <w:tcW w:w="0" w:type="auto"/>
+            <w:tcBorders>
+              <w:top w:val="single" w:sz="6" w:space="0" w:color="CBD5E1"/>
+              <w:left w:val="single" w:sz="6" w:space="0" w:color="CBD5E1"/>
+              <w:bottom w:val="single" w:sz="6" w:space="0" w:color="CBD5E1"/>
+              <w:right w:val="single" w:sz="6" w:space="0" w:color="CBD5E1"/>
+            </w:tcBorders>
+            <w:tcMar>
+              <w:top w:w="105" w:type="dxa"/>
+              <w:left w:w="180" w:type="dxa"/>
+              <w:bottom w:w="105" w:type="dxa"/>
+              <w:right w:w="180" w:type="dxa"/>
+            </w:tcMar>
+            <w:vAlign w:val="center"/>
+            <w:hideMark/>
+          </w:tcPr>
+          <w:p>
+            <w:pPr>
+              <w:spacing w:before="180" w:after="300"/>
+              <w:rPr>
+                <w:rFonts w:ascii="Calibri" w:eastAsia="Times New Roman" w:hAnsi="Calibri" w:cs="Calibri"/>
+                <w:color w:val="1E293B"/>
+                <w:sz w:val="20"/>
+                <w:szCs w:val="20"/>
+              </w:rPr>
+            </w:pPr>
+            <w:r>
+              <w:rPr>
+                <w:rStyle w:val="CdigoHTML"/>
+                <w:color w:val="1E293B"/>
+              </w:rPr>
               <w:t>jvk-editor4</w:t>
-            </w:r>
-            <w:r>
-              <w:rPr>
-                <w:rFonts w:ascii="Calibri" w:eastAsia="Times New Roman" w:hAnsi="Calibri" w:cs="Calibri"/>
-                <w:color w:val="1E293B"/>
-                <w:sz w:val="20"/>
-                <w:szCs w:val="20"/>
-              </w:rPr>
-              <w:t xml:space="preserve"> (Técnico Editor 4)</w:t>
             </w:r>
           </w:p>
         </w:tc>
@@ -2811,7 +2937,7 @@
       </w:tr>
       <w:tr>
         <w:trPr>
-          <w:divId w:val="109663700"/>
+          <w:divId w:val="441268612"/>
         </w:trPr>
         <w:tc>
           <w:tcPr>
@@ -2849,16 +2975,44 @@
                 <w:sz w:val="20"/>
                 <w:szCs w:val="20"/>
               </w:rPr>
+              <w:t>Mayra Benavides</w:t>
+            </w:r>
+          </w:p>
+        </w:tc>
+        <w:tc>
+          <w:tcPr>
+            <w:tcW w:w="0" w:type="auto"/>
+            <w:tcBorders>
+              <w:top w:val="single" w:sz="6" w:space="0" w:color="CBD5E1"/>
+              <w:left w:val="single" w:sz="6" w:space="0" w:color="CBD5E1"/>
+              <w:bottom w:val="single" w:sz="6" w:space="0" w:color="CBD5E1"/>
+              <w:right w:val="single" w:sz="6" w:space="0" w:color="CBD5E1"/>
+            </w:tcBorders>
+            <w:tcMar>
+              <w:top w:w="105" w:type="dxa"/>
+              <w:left w:w="180" w:type="dxa"/>
+              <w:bottom w:w="105" w:type="dxa"/>
+              <w:right w:w="180" w:type="dxa"/>
+            </w:tcMar>
+            <w:vAlign w:val="center"/>
+            <w:hideMark/>
+          </w:tcPr>
+          <w:p>
+            <w:pPr>
+              <w:spacing w:before="180" w:after="300"/>
+              <w:rPr>
+                <w:rFonts w:ascii="Calibri" w:eastAsia="Times New Roman" w:hAnsi="Calibri" w:cs="Calibri"/>
+                <w:color w:val="1E293B"/>
+                <w:sz w:val="20"/>
+                <w:szCs w:val="20"/>
+              </w:rPr>
+            </w:pPr>
+            <w:r>
+              <w:rPr>
+                <w:rStyle w:val="CdigoHTML"/>
+                <w:color w:val="1E293B"/>
+              </w:rPr>
               <w:t>mayralisseth201</w:t>
-            </w:r>
-            <w:r>
-              <w:rPr>
-                <w:rFonts w:ascii="Calibri" w:eastAsia="Times New Roman" w:hAnsi="Calibri" w:cs="Calibri"/>
-                <w:color w:val="1E293B"/>
-                <w:sz w:val="20"/>
-                <w:szCs w:val="20"/>
-              </w:rPr>
-              <w:t xml:space="preserve"> (Técnica Mayra L.)</w:t>
             </w:r>
           </w:p>
         </w:tc>
@@ -3062,7 +3216,7 @@
       </w:tr>
       <w:tr>
         <w:trPr>
-          <w:divId w:val="109663700"/>
+          <w:divId w:val="441268612"/>
         </w:trPr>
         <w:tc>
           <w:tcPr>
@@ -3100,25 +3254,44 @@
                 <w:sz w:val="20"/>
                 <w:szCs w:val="20"/>
               </w:rPr>
+              <w:t>Pablo Barrionuevo</w:t>
+            </w:r>
+          </w:p>
+        </w:tc>
+        <w:tc>
+          <w:tcPr>
+            <w:tcW w:w="0" w:type="auto"/>
+            <w:tcBorders>
+              <w:top w:val="single" w:sz="6" w:space="0" w:color="CBD5E1"/>
+              <w:left w:val="single" w:sz="6" w:space="0" w:color="CBD5E1"/>
+              <w:bottom w:val="single" w:sz="6" w:space="0" w:color="CBD5E1"/>
+              <w:right w:val="single" w:sz="6" w:space="0" w:color="CBD5E1"/>
+            </w:tcBorders>
+            <w:tcMar>
+              <w:top w:w="105" w:type="dxa"/>
+              <w:left w:w="180" w:type="dxa"/>
+              <w:bottom w:w="105" w:type="dxa"/>
+              <w:right w:w="180" w:type="dxa"/>
+            </w:tcMar>
+            <w:vAlign w:val="center"/>
+            <w:hideMark/>
+          </w:tcPr>
+          <w:p>
+            <w:pPr>
+              <w:spacing w:before="180" w:after="300"/>
+              <w:rPr>
+                <w:rFonts w:ascii="Calibri" w:eastAsia="Times New Roman" w:hAnsi="Calibri" w:cs="Calibri"/>
+                <w:color w:val="1E293B"/>
+                <w:sz w:val="20"/>
+                <w:szCs w:val="20"/>
+              </w:rPr>
+            </w:pPr>
+            <w:r>
+              <w:rPr>
+                <w:rStyle w:val="CdigoHTML"/>
+                <w:color w:val="1E293B"/>
+              </w:rPr>
               <w:t>jvk-editor5</w:t>
-            </w:r>
-            <w:r>
-              <w:rPr>
-                <w:rFonts w:ascii="Calibri" w:eastAsia="Times New Roman" w:hAnsi="Calibri" w:cs="Calibri"/>
-                <w:color w:val="1E293B"/>
-                <w:sz w:val="20"/>
-                <w:szCs w:val="20"/>
-              </w:rPr>
-              <w:t xml:space="preserve"> </w:t>
-            </w:r>
-            <w:r>
-              <w:rPr>
-                <w:rFonts w:ascii="Calibri" w:eastAsia="Times New Roman" w:hAnsi="Calibri" w:cs="Calibri"/>
-                <w:color w:val="1E293B"/>
-                <w:sz w:val="20"/>
-                <w:szCs w:val="20"/>
-              </w:rPr>
-              <w:t>(Técnico Editor 5)</w:t>
             </w:r>
           </w:p>
         </w:tc>
@@ -3322,7 +3495,7 @@
       </w:tr>
       <w:tr>
         <w:trPr>
-          <w:divId w:val="109663700"/>
+          <w:divId w:val="441268612"/>
         </w:trPr>
         <w:tc>
           <w:tcPr>
@@ -3360,16 +3533,44 @@
                 <w:sz w:val="20"/>
                 <w:szCs w:val="20"/>
               </w:rPr>
+              <w:t>JVK Corp</w:t>
+            </w:r>
+          </w:p>
+        </w:tc>
+        <w:tc>
+          <w:tcPr>
+            <w:tcW w:w="0" w:type="auto"/>
+            <w:tcBorders>
+              <w:top w:val="single" w:sz="6" w:space="0" w:color="CBD5E1"/>
+              <w:left w:val="single" w:sz="6" w:space="0" w:color="CBD5E1"/>
+              <w:bottom w:val="single" w:sz="6" w:space="0" w:color="CBD5E1"/>
+              <w:right w:val="single" w:sz="6" w:space="0" w:color="CBD5E1"/>
+            </w:tcBorders>
+            <w:tcMar>
+              <w:top w:w="105" w:type="dxa"/>
+              <w:left w:w="180" w:type="dxa"/>
+              <w:bottom w:w="105" w:type="dxa"/>
+              <w:right w:w="180" w:type="dxa"/>
+            </w:tcMar>
+            <w:vAlign w:val="center"/>
+            <w:hideMark/>
+          </w:tcPr>
+          <w:p>
+            <w:pPr>
+              <w:spacing w:before="180" w:after="300"/>
+              <w:rPr>
+                <w:rFonts w:ascii="Calibri" w:eastAsia="Times New Roman" w:hAnsi="Calibri" w:cs="Calibri"/>
+                <w:color w:val="1E293B"/>
+                <w:sz w:val="20"/>
+                <w:szCs w:val="20"/>
+              </w:rPr>
+            </w:pPr>
+            <w:r>
+              <w:rPr>
+                <w:rStyle w:val="CdigoHTML"/>
+                <w:color w:val="1E293B"/>
+              </w:rPr>
               <w:t>jvk-corp</w:t>
-            </w:r>
-            <w:r>
-              <w:rPr>
-                <w:rFonts w:ascii="Calibri" w:eastAsia="Times New Roman" w:hAnsi="Calibri" w:cs="Calibri"/>
-                <w:color w:val="1E293B"/>
-                <w:sz w:val="20"/>
-                <w:szCs w:val="20"/>
-              </w:rPr>
-              <w:t xml:space="preserve"> (Técnico Corp)</w:t>
             </w:r>
           </w:p>
         </w:tc>
@@ -3573,7 +3774,7 @@
       </w:tr>
       <w:tr>
         <w:trPr>
-          <w:divId w:val="109663700"/>
+          <w:divId w:val="441268612"/>
         </w:trPr>
         <w:tc>
           <w:tcPr>
@@ -3611,16 +3812,44 @@
                 <w:sz w:val="20"/>
                 <w:szCs w:val="20"/>
               </w:rPr>
+              <w:t>Melany Jara</w:t>
+            </w:r>
+          </w:p>
+        </w:tc>
+        <w:tc>
+          <w:tcPr>
+            <w:tcW w:w="0" w:type="auto"/>
+            <w:tcBorders>
+              <w:top w:val="single" w:sz="6" w:space="0" w:color="CBD5E1"/>
+              <w:left w:val="single" w:sz="6" w:space="0" w:color="CBD5E1"/>
+              <w:bottom w:val="single" w:sz="6" w:space="0" w:color="CBD5E1"/>
+              <w:right w:val="single" w:sz="6" w:space="0" w:color="CBD5E1"/>
+            </w:tcBorders>
+            <w:tcMar>
+              <w:top w:w="105" w:type="dxa"/>
+              <w:left w:w="180" w:type="dxa"/>
+              <w:bottom w:w="105" w:type="dxa"/>
+              <w:right w:w="180" w:type="dxa"/>
+            </w:tcMar>
+            <w:vAlign w:val="center"/>
+            <w:hideMark/>
+          </w:tcPr>
+          <w:p>
+            <w:pPr>
+              <w:spacing w:before="180" w:after="300"/>
+              <w:rPr>
+                <w:rFonts w:ascii="Calibri" w:eastAsia="Times New Roman" w:hAnsi="Calibri" w:cs="Calibri"/>
+                <w:color w:val="1E293B"/>
+                <w:sz w:val="20"/>
+                <w:szCs w:val="20"/>
+              </w:rPr>
+            </w:pPr>
+            <w:r>
+              <w:rPr>
+                <w:rStyle w:val="CdigoHTML"/>
+                <w:color w:val="1E293B"/>
+              </w:rPr>
               <w:t>jvk-editor</w:t>
-            </w:r>
-            <w:r>
-              <w:rPr>
-                <w:rFonts w:ascii="Calibri" w:eastAsia="Times New Roman" w:hAnsi="Calibri" w:cs="Calibri"/>
-                <w:color w:val="1E293B"/>
-                <w:sz w:val="20"/>
-                <w:szCs w:val="20"/>
-              </w:rPr>
-              <w:t xml:space="preserve"> (Técnico Editor 1)</w:t>
             </w:r>
           </w:p>
         </w:tc>
@@ -3824,7 +4053,7 @@
       </w:tr>
       <w:tr>
         <w:trPr>
-          <w:divId w:val="109663700"/>
+          <w:divId w:val="441268612"/>
         </w:trPr>
         <w:tc>
           <w:tcPr>
@@ -3862,25 +4091,44 @@
                 <w:sz w:val="20"/>
                 <w:szCs w:val="20"/>
               </w:rPr>
+              <w:t>Dylan Chavez</w:t>
+            </w:r>
+          </w:p>
+        </w:tc>
+        <w:tc>
+          <w:tcPr>
+            <w:tcW w:w="0" w:type="auto"/>
+            <w:tcBorders>
+              <w:top w:val="single" w:sz="6" w:space="0" w:color="CBD5E1"/>
+              <w:left w:val="single" w:sz="6" w:space="0" w:color="CBD5E1"/>
+              <w:bottom w:val="single" w:sz="6" w:space="0" w:color="CBD5E1"/>
+              <w:right w:val="single" w:sz="6" w:space="0" w:color="CBD5E1"/>
+            </w:tcBorders>
+            <w:tcMar>
+              <w:top w:w="105" w:type="dxa"/>
+              <w:left w:w="180" w:type="dxa"/>
+              <w:bottom w:w="105" w:type="dxa"/>
+              <w:right w:w="180" w:type="dxa"/>
+            </w:tcMar>
+            <w:vAlign w:val="center"/>
+            <w:hideMark/>
+          </w:tcPr>
+          <w:p>
+            <w:pPr>
+              <w:spacing w:before="180" w:after="300"/>
+              <w:rPr>
+                <w:rFonts w:ascii="Calibri" w:eastAsia="Times New Roman" w:hAnsi="Calibri" w:cs="Calibri"/>
+                <w:color w:val="1E293B"/>
+                <w:sz w:val="20"/>
+                <w:szCs w:val="20"/>
+              </w:rPr>
+            </w:pPr>
+            <w:r>
+              <w:rPr>
+                <w:rStyle w:val="CdigoHTML"/>
+                <w:color w:val="1E293B"/>
+              </w:rPr>
               <w:t>jvk-editor3</w:t>
-            </w:r>
-            <w:r>
-              <w:rPr>
-                <w:rFonts w:ascii="Calibri" w:eastAsia="Times New Roman" w:hAnsi="Calibri" w:cs="Calibri"/>
-                <w:color w:val="1E293B"/>
-                <w:sz w:val="20"/>
-                <w:szCs w:val="20"/>
-              </w:rPr>
-              <w:t xml:space="preserve"> </w:t>
-            </w:r>
-            <w:r>
-              <w:rPr>
-                <w:rFonts w:ascii="Calibri" w:eastAsia="Times New Roman" w:hAnsi="Calibri" w:cs="Calibri"/>
-                <w:color w:val="1E293B"/>
-                <w:sz w:val="20"/>
-                <w:szCs w:val="20"/>
-              </w:rPr>
-              <w:t>(Técnico Editor 3)</w:t>
             </w:r>
           </w:p>
         </w:tc>
@@ -4084,7 +4332,7 @@
       </w:tr>
       <w:tr>
         <w:trPr>
-          <w:divId w:val="109663700"/>
+          <w:divId w:val="441268612"/>
         </w:trPr>
         <w:tc>
           <w:tcPr>
@@ -4122,16 +4370,44 @@
                 <w:sz w:val="20"/>
                 <w:szCs w:val="20"/>
               </w:rPr>
+              <w:t>Huguito Ipial</w:t>
+            </w:r>
+          </w:p>
+        </w:tc>
+        <w:tc>
+          <w:tcPr>
+            <w:tcW w:w="0" w:type="auto"/>
+            <w:tcBorders>
+              <w:top w:val="single" w:sz="6" w:space="0" w:color="CBD5E1"/>
+              <w:left w:val="single" w:sz="6" w:space="0" w:color="CBD5E1"/>
+              <w:bottom w:val="single" w:sz="6" w:space="0" w:color="CBD5E1"/>
+              <w:right w:val="single" w:sz="6" w:space="0" w:color="CBD5E1"/>
+            </w:tcBorders>
+            <w:tcMar>
+              <w:top w:w="105" w:type="dxa"/>
+              <w:left w:w="180" w:type="dxa"/>
+              <w:bottom w:w="105" w:type="dxa"/>
+              <w:right w:w="180" w:type="dxa"/>
+            </w:tcMar>
+            <w:vAlign w:val="center"/>
+            <w:hideMark/>
+          </w:tcPr>
+          <w:p>
+            <w:pPr>
+              <w:spacing w:before="180" w:after="300"/>
+              <w:rPr>
+                <w:rFonts w:ascii="Calibri" w:eastAsia="Times New Roman" w:hAnsi="Calibri" w:cs="Calibri"/>
+                <w:color w:val="1E293B"/>
+                <w:sz w:val="20"/>
+                <w:szCs w:val="20"/>
+              </w:rPr>
+            </w:pPr>
+            <w:r>
+              <w:rPr>
+                <w:rStyle w:val="CdigoHTML"/>
+                <w:color w:val="1E293B"/>
+              </w:rPr>
               <w:t>jvk-editor2</w:t>
-            </w:r>
-            <w:r>
-              <w:rPr>
-                <w:rFonts w:ascii="Calibri" w:eastAsia="Times New Roman" w:hAnsi="Calibri" w:cs="Calibri"/>
-                <w:color w:val="1E293B"/>
-                <w:sz w:val="20"/>
-                <w:szCs w:val="20"/>
-              </w:rPr>
-              <w:t xml:space="preserve"> (Técnico Editor 2)</w:t>
             </w:r>
           </w:p>
         </w:tc>
@@ -4335,7 +4611,7 @@
       </w:tr>
       <w:tr>
         <w:trPr>
-          <w:divId w:val="109663700"/>
+          <w:divId w:val="441268612"/>
         </w:trPr>
         <w:tc>
           <w:tcPr>
@@ -4378,6 +4654,50 @@
                 <w:szCs w:val="20"/>
               </w:rPr>
               <w:t>TOTALES DEL DÍA</w:t>
+            </w:r>
+          </w:p>
+        </w:tc>
+        <w:tc>
+          <w:tcPr>
+            <w:tcW w:w="0" w:type="auto"/>
+            <w:tcBorders>
+              <w:top w:val="single" w:sz="6" w:space="0" w:color="CBD5E1"/>
+              <w:left w:val="single" w:sz="6" w:space="0" w:color="CBD5E1"/>
+              <w:bottom w:val="single" w:sz="6" w:space="0" w:color="CBD5E1"/>
+              <w:right w:val="single" w:sz="6" w:space="0" w:color="CBD5E1"/>
+            </w:tcBorders>
+            <w:shd w:val="clear" w:color="auto" w:fill="E0F2FE"/>
+            <w:tcMar>
+              <w:top w:w="105" w:type="dxa"/>
+              <w:left w:w="180" w:type="dxa"/>
+              <w:bottom w:w="105" w:type="dxa"/>
+              <w:right w:w="180" w:type="dxa"/>
+            </w:tcMar>
+            <w:vAlign w:val="center"/>
+            <w:hideMark/>
+          </w:tcPr>
+          <w:p>
+            <w:pPr>
+              <w:spacing w:before="180" w:after="300"/>
+              <w:rPr>
+                <w:rFonts w:ascii="Calibri" w:eastAsia="Times New Roman" w:hAnsi="Calibri" w:cs="Calibri"/>
+                <w:b/>
+                <w:bCs/>
+                <w:color w:val="1E293B"/>
+                <w:sz w:val="20"/>
+                <w:szCs w:val="20"/>
+              </w:rPr>
+            </w:pPr>
+            <w:r>
+              <w:rPr>
+                <w:rFonts w:ascii="Calibri" w:eastAsia="Times New Roman" w:hAnsi="Calibri" w:cs="Calibri"/>
+                <w:b/>
+                <w:bCs/>
+                <w:color w:val="1E293B"/>
+                <w:sz w:val="20"/>
+                <w:szCs w:val="20"/>
+              </w:rPr>
+              <w:t>—</w:t>
             </w:r>
           </w:p>
         </w:tc>
@@ -4608,7 +4928,7 @@
         <w:pStyle w:val="Ttulo2"/>
         <w:spacing w:after="600"/>
         <w:ind w:left="600" w:right="600"/>
-        <w:divId w:val="109663700"/>
+        <w:divId w:val="441268612"/>
         <w:rPr>
           <w:rFonts w:ascii="Calibri" w:eastAsia="Times New Roman" w:hAnsi="Calibri" w:cs="Calibri"/>
           <w:lang w:val="es-ES"/>
@@ -4619,7 +4939,7 @@
           <w:rFonts w:ascii="Calibri" w:eastAsia="Times New Roman" w:hAnsi="Calibri" w:cs="Calibri"/>
           <w:lang w:val="es-ES"/>
         </w:rPr>
-        <w:t>5. Rendimiento Diario Comparativo (22 vs 23 de Julio)</w:t>
+        <w:t>5. Rendimiento Diario Comparativo por Técnico (22 vs 23 de Julio)</w:t>
       </w:r>
     </w:p>
     <w:tbl>
@@ -4634,14 +4954,15 @@
         <w:tblLook w:val="04A0" w:firstRow="1" w:lastRow="0" w:firstColumn="1" w:lastColumn="0" w:noHBand="0" w:noVBand="1"/>
       </w:tblPr>
       <w:tblGrid>
-        <w:gridCol w:w="1801"/>
-        <w:gridCol w:w="1844"/>
-        <w:gridCol w:w="1844"/>
-        <w:gridCol w:w="2999"/>
+        <w:gridCol w:w="1647"/>
+        <w:gridCol w:w="2161"/>
+        <w:gridCol w:w="1288"/>
+        <w:gridCol w:w="1288"/>
+        <w:gridCol w:w="2104"/>
       </w:tblGrid>
       <w:tr>
         <w:trPr>
-          <w:divId w:val="109663700"/>
+          <w:divId w:val="441268612"/>
           <w:tblHeader/>
         </w:trPr>
         <w:tc>
@@ -4684,7 +5005,7 @@
                 <w:sz w:val="20"/>
                 <w:szCs w:val="20"/>
               </w:rPr>
-              <w:t>Técnico / Usuario</w:t>
+              <w:t>Técnico Investigador</w:t>
             </w:r>
           </w:p>
         </w:tc>
@@ -4728,7 +5049,7 @@
                 <w:sz w:val="20"/>
                 <w:szCs w:val="20"/>
               </w:rPr>
-              <w:t>Fichas Adic. (22-Jul)</w:t>
+              <w:t>Usuario QField</w:t>
             </w:r>
           </w:p>
         </w:tc>
@@ -4772,7 +5093,7 @@
                 <w:sz w:val="20"/>
                 <w:szCs w:val="20"/>
               </w:rPr>
-              <w:t>Fichas Adic. (23-Jul)</w:t>
+              <w:t>Fichas Adic. (22-Jul)</w:t>
             </w:r>
           </w:p>
         </w:tc>
@@ -4816,6 +5137,50 @@
                 <w:sz w:val="20"/>
                 <w:szCs w:val="20"/>
               </w:rPr>
+              <w:t>Fichas Adic. (23-Jul)</w:t>
+            </w:r>
+          </w:p>
+        </w:tc>
+        <w:tc>
+          <w:tcPr>
+            <w:tcW w:w="0" w:type="auto"/>
+            <w:tcBorders>
+              <w:top w:val="single" w:sz="6" w:space="0" w:color="0F172A"/>
+              <w:left w:val="single" w:sz="6" w:space="0" w:color="0F172A"/>
+              <w:bottom w:val="single" w:sz="6" w:space="0" w:color="0F172A"/>
+              <w:right w:val="single" w:sz="6" w:space="0" w:color="0F172A"/>
+            </w:tcBorders>
+            <w:shd w:val="clear" w:color="auto" w:fill="0F172A"/>
+            <w:tcMar>
+              <w:top w:w="120" w:type="dxa"/>
+              <w:left w:w="180" w:type="dxa"/>
+              <w:bottom w:w="120" w:type="dxa"/>
+              <w:right w:w="180" w:type="dxa"/>
+            </w:tcMar>
+            <w:vAlign w:val="center"/>
+            <w:hideMark/>
+          </w:tcPr>
+          <w:p>
+            <w:pPr>
+              <w:spacing w:before="180" w:after="300"/>
+              <w:rPr>
+                <w:rFonts w:ascii="Calibri" w:eastAsia="Times New Roman" w:hAnsi="Calibri" w:cs="Calibri"/>
+                <w:b/>
+                <w:bCs/>
+                <w:color w:val="FFFFFF"/>
+                <w:sz w:val="20"/>
+                <w:szCs w:val="20"/>
+              </w:rPr>
+            </w:pPr>
+            <w:r>
+              <w:rPr>
+                <w:rFonts w:ascii="Calibri" w:eastAsia="Times New Roman" w:hAnsi="Calibri" w:cs="Calibri"/>
+                <w:b/>
+                <w:bCs/>
+                <w:color w:val="FFFFFF"/>
+                <w:sz w:val="20"/>
+                <w:szCs w:val="20"/>
+              </w:rPr>
               <w:t>Rendimiento Diario Promedio</w:t>
             </w:r>
           </w:p>
@@ -4823,7 +5188,7 @@
       </w:tr>
       <w:tr>
         <w:trPr>
-          <w:divId w:val="109663700"/>
+          <w:divId w:val="441268612"/>
         </w:trPr>
         <w:tc>
           <w:tcPr>
@@ -4860,6 +5225,43 @@
                 <w:color w:val="1E293B"/>
                 <w:sz w:val="20"/>
                 <w:szCs w:val="20"/>
+              </w:rPr>
+              <w:t>Adriana Cuascota</w:t>
+            </w:r>
+          </w:p>
+        </w:tc>
+        <w:tc>
+          <w:tcPr>
+            <w:tcW w:w="0" w:type="auto"/>
+            <w:tcBorders>
+              <w:top w:val="single" w:sz="6" w:space="0" w:color="CBD5E1"/>
+              <w:left w:val="single" w:sz="6" w:space="0" w:color="CBD5E1"/>
+              <w:bottom w:val="single" w:sz="6" w:space="0" w:color="CBD5E1"/>
+              <w:right w:val="single" w:sz="6" w:space="0" w:color="CBD5E1"/>
+            </w:tcBorders>
+            <w:tcMar>
+              <w:top w:w="105" w:type="dxa"/>
+              <w:left w:w="180" w:type="dxa"/>
+              <w:bottom w:w="105" w:type="dxa"/>
+              <w:right w:w="180" w:type="dxa"/>
+            </w:tcMar>
+            <w:vAlign w:val="center"/>
+            <w:hideMark/>
+          </w:tcPr>
+          <w:p>
+            <w:pPr>
+              <w:spacing w:before="180" w:after="300"/>
+              <w:rPr>
+                <w:rFonts w:ascii="Calibri" w:eastAsia="Times New Roman" w:hAnsi="Calibri" w:cs="Calibri"/>
+                <w:color w:val="1E293B"/>
+                <w:sz w:val="20"/>
+                <w:szCs w:val="20"/>
+              </w:rPr>
+            </w:pPr>
+            <w:r>
+              <w:rPr>
+                <w:rStyle w:val="CdigoHTML"/>
+                <w:color w:val="1E293B"/>
               </w:rPr>
               <w:t>jvk-editor6</w:t>
             </w:r>
@@ -4986,7 +5388,7 @@
       </w:tr>
       <w:tr>
         <w:trPr>
-          <w:divId w:val="109663700"/>
+          <w:divId w:val="441268612"/>
         </w:trPr>
         <w:tc>
           <w:tcPr>
@@ -5023,6 +5425,43 @@
                 <w:color w:val="1E293B"/>
                 <w:sz w:val="20"/>
                 <w:szCs w:val="20"/>
+              </w:rPr>
+              <w:t>Martha Simbaña</w:t>
+            </w:r>
+          </w:p>
+        </w:tc>
+        <w:tc>
+          <w:tcPr>
+            <w:tcW w:w="0" w:type="auto"/>
+            <w:tcBorders>
+              <w:top w:val="single" w:sz="6" w:space="0" w:color="CBD5E1"/>
+              <w:left w:val="single" w:sz="6" w:space="0" w:color="CBD5E1"/>
+              <w:bottom w:val="single" w:sz="6" w:space="0" w:color="CBD5E1"/>
+              <w:right w:val="single" w:sz="6" w:space="0" w:color="CBD5E1"/>
+            </w:tcBorders>
+            <w:tcMar>
+              <w:top w:w="105" w:type="dxa"/>
+              <w:left w:w="180" w:type="dxa"/>
+              <w:bottom w:w="105" w:type="dxa"/>
+              <w:right w:w="180" w:type="dxa"/>
+            </w:tcMar>
+            <w:vAlign w:val="center"/>
+            <w:hideMark/>
+          </w:tcPr>
+          <w:p>
+            <w:pPr>
+              <w:spacing w:before="180" w:after="300"/>
+              <w:rPr>
+                <w:rFonts w:ascii="Calibri" w:eastAsia="Times New Roman" w:hAnsi="Calibri" w:cs="Calibri"/>
+                <w:color w:val="1E293B"/>
+                <w:sz w:val="20"/>
+                <w:szCs w:val="20"/>
+              </w:rPr>
+            </w:pPr>
+            <w:r>
+              <w:rPr>
+                <w:rStyle w:val="CdigoHTML"/>
+                <w:color w:val="1E293B"/>
               </w:rPr>
               <w:t>jvk-editor4</w:t>
             </w:r>
@@ -5149,7 +5588,7 @@
       </w:tr>
       <w:tr>
         <w:trPr>
-          <w:divId w:val="109663700"/>
+          <w:divId w:val="441268612"/>
         </w:trPr>
         <w:tc>
           <w:tcPr>
@@ -5186,6 +5625,43 @@
                 <w:color w:val="1E293B"/>
                 <w:sz w:val="20"/>
                 <w:szCs w:val="20"/>
+              </w:rPr>
+              <w:t>Mayra Benavides</w:t>
+            </w:r>
+          </w:p>
+        </w:tc>
+        <w:tc>
+          <w:tcPr>
+            <w:tcW w:w="0" w:type="auto"/>
+            <w:tcBorders>
+              <w:top w:val="single" w:sz="6" w:space="0" w:color="CBD5E1"/>
+              <w:left w:val="single" w:sz="6" w:space="0" w:color="CBD5E1"/>
+              <w:bottom w:val="single" w:sz="6" w:space="0" w:color="CBD5E1"/>
+              <w:right w:val="single" w:sz="6" w:space="0" w:color="CBD5E1"/>
+            </w:tcBorders>
+            <w:tcMar>
+              <w:top w:w="105" w:type="dxa"/>
+              <w:left w:w="180" w:type="dxa"/>
+              <w:bottom w:w="105" w:type="dxa"/>
+              <w:right w:w="180" w:type="dxa"/>
+            </w:tcMar>
+            <w:vAlign w:val="center"/>
+            <w:hideMark/>
+          </w:tcPr>
+          <w:p>
+            <w:pPr>
+              <w:spacing w:before="180" w:after="300"/>
+              <w:rPr>
+                <w:rFonts w:ascii="Calibri" w:eastAsia="Times New Roman" w:hAnsi="Calibri" w:cs="Calibri"/>
+                <w:color w:val="1E293B"/>
+                <w:sz w:val="20"/>
+                <w:szCs w:val="20"/>
+              </w:rPr>
+            </w:pPr>
+            <w:r>
+              <w:rPr>
+                <w:rStyle w:val="CdigoHTML"/>
+                <w:color w:val="1E293B"/>
               </w:rPr>
               <w:t>mayralisseth201</w:t>
             </w:r>
@@ -5312,7 +5788,7 @@
       </w:tr>
       <w:tr>
         <w:trPr>
-          <w:divId w:val="109663700"/>
+          <w:divId w:val="441268612"/>
         </w:trPr>
         <w:tc>
           <w:tcPr>
@@ -5349,6 +5825,43 @@
                 <w:color w:val="1E293B"/>
                 <w:sz w:val="20"/>
                 <w:szCs w:val="20"/>
+              </w:rPr>
+              <w:t>JVK Corp</w:t>
+            </w:r>
+          </w:p>
+        </w:tc>
+        <w:tc>
+          <w:tcPr>
+            <w:tcW w:w="0" w:type="auto"/>
+            <w:tcBorders>
+              <w:top w:val="single" w:sz="6" w:space="0" w:color="CBD5E1"/>
+              <w:left w:val="single" w:sz="6" w:space="0" w:color="CBD5E1"/>
+              <w:bottom w:val="single" w:sz="6" w:space="0" w:color="CBD5E1"/>
+              <w:right w:val="single" w:sz="6" w:space="0" w:color="CBD5E1"/>
+            </w:tcBorders>
+            <w:tcMar>
+              <w:top w:w="105" w:type="dxa"/>
+              <w:left w:w="180" w:type="dxa"/>
+              <w:bottom w:w="105" w:type="dxa"/>
+              <w:right w:w="180" w:type="dxa"/>
+            </w:tcMar>
+            <w:vAlign w:val="center"/>
+            <w:hideMark/>
+          </w:tcPr>
+          <w:p>
+            <w:pPr>
+              <w:spacing w:before="180" w:after="300"/>
+              <w:rPr>
+                <w:rFonts w:ascii="Calibri" w:eastAsia="Times New Roman" w:hAnsi="Calibri" w:cs="Calibri"/>
+                <w:color w:val="1E293B"/>
+                <w:sz w:val="20"/>
+                <w:szCs w:val="20"/>
+              </w:rPr>
+            </w:pPr>
+            <w:r>
+              <w:rPr>
+                <w:rStyle w:val="CdigoHTML"/>
+                <w:color w:val="1E293B"/>
               </w:rPr>
               <w:t>jvk-corp</w:t>
             </w:r>
@@ -5475,7 +5988,7 @@
       </w:tr>
       <w:tr>
         <w:trPr>
-          <w:divId w:val="109663700"/>
+          <w:divId w:val="441268612"/>
         </w:trPr>
         <w:tc>
           <w:tcPr>
@@ -5512,6 +6025,43 @@
                 <w:color w:val="1E293B"/>
                 <w:sz w:val="20"/>
                 <w:szCs w:val="20"/>
+              </w:rPr>
+              <w:t>Pablo Barrionuevo</w:t>
+            </w:r>
+          </w:p>
+        </w:tc>
+        <w:tc>
+          <w:tcPr>
+            <w:tcW w:w="0" w:type="auto"/>
+            <w:tcBorders>
+              <w:top w:val="single" w:sz="6" w:space="0" w:color="CBD5E1"/>
+              <w:left w:val="single" w:sz="6" w:space="0" w:color="CBD5E1"/>
+              <w:bottom w:val="single" w:sz="6" w:space="0" w:color="CBD5E1"/>
+              <w:right w:val="single" w:sz="6" w:space="0" w:color="CBD5E1"/>
+            </w:tcBorders>
+            <w:tcMar>
+              <w:top w:w="105" w:type="dxa"/>
+              <w:left w:w="180" w:type="dxa"/>
+              <w:bottom w:w="105" w:type="dxa"/>
+              <w:right w:w="180" w:type="dxa"/>
+            </w:tcMar>
+            <w:vAlign w:val="center"/>
+            <w:hideMark/>
+          </w:tcPr>
+          <w:p>
+            <w:pPr>
+              <w:spacing w:before="180" w:after="300"/>
+              <w:rPr>
+                <w:rFonts w:ascii="Calibri" w:eastAsia="Times New Roman" w:hAnsi="Calibri" w:cs="Calibri"/>
+                <w:color w:val="1E293B"/>
+                <w:sz w:val="20"/>
+                <w:szCs w:val="20"/>
+              </w:rPr>
+            </w:pPr>
+            <w:r>
+              <w:rPr>
+                <w:rStyle w:val="CdigoHTML"/>
+                <w:color w:val="1E293B"/>
               </w:rPr>
               <w:t>jvk-editor5</w:t>
             </w:r>
@@ -5638,7 +6188,7 @@
       </w:tr>
       <w:tr>
         <w:trPr>
-          <w:divId w:val="109663700"/>
+          <w:divId w:val="441268612"/>
         </w:trPr>
         <w:tc>
           <w:tcPr>
@@ -5675,6 +6225,43 @@
                 <w:color w:val="1E293B"/>
                 <w:sz w:val="20"/>
                 <w:szCs w:val="20"/>
+              </w:rPr>
+              <w:t>Dylan Chavez</w:t>
+            </w:r>
+          </w:p>
+        </w:tc>
+        <w:tc>
+          <w:tcPr>
+            <w:tcW w:w="0" w:type="auto"/>
+            <w:tcBorders>
+              <w:top w:val="single" w:sz="6" w:space="0" w:color="CBD5E1"/>
+              <w:left w:val="single" w:sz="6" w:space="0" w:color="CBD5E1"/>
+              <w:bottom w:val="single" w:sz="6" w:space="0" w:color="CBD5E1"/>
+              <w:right w:val="single" w:sz="6" w:space="0" w:color="CBD5E1"/>
+            </w:tcBorders>
+            <w:tcMar>
+              <w:top w:w="105" w:type="dxa"/>
+              <w:left w:w="180" w:type="dxa"/>
+              <w:bottom w:w="105" w:type="dxa"/>
+              <w:right w:w="180" w:type="dxa"/>
+            </w:tcMar>
+            <w:vAlign w:val="center"/>
+            <w:hideMark/>
+          </w:tcPr>
+          <w:p>
+            <w:pPr>
+              <w:spacing w:before="180" w:after="300"/>
+              <w:rPr>
+                <w:rFonts w:ascii="Calibri" w:eastAsia="Times New Roman" w:hAnsi="Calibri" w:cs="Calibri"/>
+                <w:color w:val="1E293B"/>
+                <w:sz w:val="20"/>
+                <w:szCs w:val="20"/>
+              </w:rPr>
+            </w:pPr>
+            <w:r>
+              <w:rPr>
+                <w:rStyle w:val="CdigoHTML"/>
+                <w:color w:val="1E293B"/>
               </w:rPr>
               <w:t>jvk-editor3</w:t>
             </w:r>
@@ -5804,7 +6391,7 @@
       <w:pPr>
         <w:pStyle w:val="Ttulo2"/>
         <w:ind w:left="600" w:right="600"/>
-        <w:divId w:val="109663700"/>
+        <w:divId w:val="441268612"/>
         <w:rPr>
           <w:rFonts w:ascii="Calibri" w:eastAsia="Times New Roman" w:hAnsi="Calibri" w:cs="Calibri"/>
           <w:lang w:val="es-ES"/>
@@ -5823,7 +6410,7 @@
         <w:shd w:val="clear" w:color="auto" w:fill="FEFCE8"/>
         <w:spacing w:before="240" w:after="240"/>
         <w:ind w:left="600" w:right="600"/>
-        <w:divId w:val="1361778985"/>
+        <w:divId w:val="1056776169"/>
         <w:rPr>
           <w:rFonts w:ascii="Calibri" w:eastAsia="Times New Roman" w:hAnsi="Calibri" w:cs="Calibri"/>
           <w:color w:val="1E293B"/>
@@ -5841,16 +6428,27 @@
           <w:szCs w:val="21"/>
           <w:lang w:val="es-ES"/>
         </w:rPr>
-        <w:t>Capacidad de Procesamiento por Modalidad:</w:t>
-      </w:r>
-      <w:r>
-        <w:rPr>
+        <w:t>Capacidad de</w:t>
+      </w:r>
+      <w:r>
+        <w:rPr>
+          <w:rStyle w:val="Textoennegrita"/>
           <w:rFonts w:ascii="Calibri" w:eastAsia="Times New Roman" w:hAnsi="Calibri" w:cs="Calibri"/>
           <w:color w:val="1E293B"/>
           <w:sz w:val="21"/>
           <w:szCs w:val="21"/>
           <w:lang w:val="es-ES"/>
         </w:rPr>
+        <w:t xml:space="preserve"> Procesamiento por Modalidad:</w:t>
+      </w:r>
+      <w:r>
+        <w:rPr>
+          <w:rFonts w:ascii="Calibri" w:eastAsia="Times New Roman" w:hAnsi="Calibri" w:cs="Calibri"/>
+          <w:color w:val="1E293B"/>
+          <w:sz w:val="21"/>
+          <w:szCs w:val="21"/>
+          <w:lang w:val="es-ES"/>
+        </w:rPr>
         <w:br/>
         <w:t xml:space="preserve">• </w:t>
       </w:r>
@@ -5905,14 +6503,24 @@
           <w:szCs w:val="21"/>
           <w:lang w:val="es-ES"/>
         </w:rPr>
-        <w:t xml:space="preserve"> 35 a 116 fichas/día por técnico (al contar con las Secciones 1, 2, 3, 5 y 6 heredadas). </w:t>
+        <w:t xml:space="preserve"> </w:t>
+      </w:r>
+      <w:r>
+        <w:rPr>
+          <w:rFonts w:ascii="Calibri" w:eastAsia="Times New Roman" w:hAnsi="Calibri" w:cs="Calibri"/>
+          <w:color w:val="1E293B"/>
+          <w:sz w:val="21"/>
+          <w:szCs w:val="21"/>
+          <w:lang w:val="es-ES"/>
+        </w:rPr>
+        <w:t xml:space="preserve">35 a 116 fichas/día por técnico (al contar con las Secciones 1, 2, 3, 5 y 6 heredadas). </w:t>
       </w:r>
     </w:p>
     <w:p>
       <w:pPr>
         <w:pStyle w:val="Ttulo3"/>
         <w:ind w:left="600" w:right="600"/>
-        <w:divId w:val="109663700"/>
+        <w:divId w:val="441268612"/>
         <w:rPr>
           <w:rFonts w:ascii="Calibri" w:eastAsia="Times New Roman" w:hAnsi="Calibri" w:cs="Calibri"/>
           <w:lang w:val="es-ES"/>
@@ -5930,7 +6538,7 @@
       <w:pPr>
         <w:pStyle w:val="NormalWeb"/>
         <w:ind w:left="600" w:right="600"/>
-        <w:divId w:val="109663700"/>
+        <w:divId w:val="441268612"/>
         <w:rPr>
           <w:rFonts w:ascii="Calibri" w:hAnsi="Calibri" w:cs="Calibri"/>
           <w:color w:val="1E293B"/>
@@ -5968,7 +6576,7 @@
         <w:pStyle w:val="NormalWeb"/>
         <w:ind w:left="600" w:right="600"/>
         <w:jc w:val="center"/>
-        <w:divId w:val="109663700"/>
+        <w:divId w:val="441268612"/>
         <w:rPr>
           <w:rFonts w:ascii="Calibri" w:hAnsi="Calibri" w:cs="Calibri"/>
           <w:b/>
@@ -5989,7 +6597,7 @@
           <w:szCs w:val="26"/>
           <w:lang w:val="es-ES"/>
         </w:rPr>
-        <w:t xml:space="preserve">Tiempo Real de Cierre Restante = </w:t>
+        <w:t>Tiempo Real de Cierre Restante = 1,843 fichas pendientes / 275 fichas reales/día</w:t>
       </w:r>
       <w:r>
         <w:rPr>
@@ -6001,14 +6609,14 @@
           <w:szCs w:val="26"/>
           <w:lang w:val="es-ES"/>
         </w:rPr>
-        <w:t xml:space="preserve">1,843 fichas pendientes / 275 fichas reales/día = 6.7 Días Laborables </w:t>
+        <w:t xml:space="preserve"> = 6.7 Días Laborables </w:t>
       </w:r>
     </w:p>
     <w:p>
       <w:pPr>
         <w:pStyle w:val="NormalWeb"/>
         <w:ind w:left="600" w:right="600"/>
-        <w:divId w:val="109663700"/>
+        <w:divId w:val="441268612"/>
         <w:rPr>
           <w:rFonts w:ascii="Calibri" w:hAnsi="Calibri" w:cs="Calibri"/>
           <w:color w:val="1E293B"/>
@@ -6039,16 +6647,7 @@
           <w:color w:val="1E293B"/>
           <w:lang w:val="es-ES"/>
         </w:rPr>
-        <w:t>100% investigado y cerrado en apr</w:t>
-      </w:r>
-      <w:r>
-        <w:rPr>
-          <w:rStyle w:val="Textoennegrita"/>
-          <w:rFonts w:ascii="Calibri" w:hAnsi="Calibri" w:cs="Calibri"/>
-          <w:color w:val="1E293B"/>
-          <w:lang w:val="es-ES"/>
-        </w:rPr>
-        <w:t>oximadamente 6 a 7 días de trabajo</w:t>
+        <w:t>100% investigado y cerrado en aproximadamente 6 a 7 días de trabajo</w:t>
       </w:r>
       <w:r>
         <w:rPr>
@@ -6064,7 +6663,7 @@
         <w:spacing w:before="600" w:after="600"/>
         <w:ind w:left="600" w:right="600"/>
         <w:jc w:val="center"/>
-        <w:divId w:val="1146161660"/>
+        <w:divId w:val="1073551255"/>
         <w:rPr>
           <w:rFonts w:ascii="Calibri" w:eastAsia="Times New Roman" w:hAnsi="Calibri" w:cs="Calibri"/>
           <w:color w:val="64748B"/>
@@ -6081,7 +6680,17 @@
           <w:szCs w:val="18"/>
           <w:lang w:val="es-ES"/>
         </w:rPr>
-        <w:t>Consorcio Cayambe SPT — Sistema de Riego Comunitario Guanguilquí Porotog</w:t>
+        <w:t>Consorcio C</w:t>
+      </w:r>
+      <w:r>
+        <w:rPr>
+          <w:rFonts w:ascii="Calibri" w:eastAsia="Times New Roman" w:hAnsi="Calibri" w:cs="Calibri"/>
+          <w:color w:val="64748B"/>
+          <w:sz w:val="18"/>
+          <w:szCs w:val="18"/>
+          <w:lang w:val="es-ES"/>
+        </w:rPr>
+        <w:t>ayambe SPT — Sistema de Riego Comunitario Guanguilquí Porotog</w:t>
       </w:r>
       <w:r>
         <w:rPr>
@@ -6108,9 +6717,158 @@
 <file path=word/numbering.xml><?xml version="1.0" encoding="utf-8"?>
 <w:numbering xmlns:wpc="http://schemas.microsoft.com/office/word/2010/wordprocessingCanvas" xmlns:cx="http://schemas.microsoft.com/office/drawing/2014/chartex" xmlns:cx1="http://schemas.microsoft.com/office/drawing/2015/9/8/chartex" xmlns:cx2="http://schemas.microsoft.com/office/drawing/2015/10/21/chartex" xmlns:cx3="http://schemas.microsoft.com/office/drawing/2016/5/9/chartex" xmlns:cx4="http://schemas.microsoft.com/office/drawing/2016/5/10/chartex" xmlns:cx5="http://schemas.microsoft.com/office/drawing/2016/5/11/chartex" xmlns:cx6="http://schemas.microsoft.com/office/drawing/2016/5/12/chartex" xmlns:cx7="http://schemas.microsoft.com/office/drawing/2016/5/13/chartex" xmlns:cx8="http://schemas.microsoft.com/office/drawing/2016/5/14/chartex" xmlns:mc="http://schemas.openxmlformats.org/markup-compatibility/2006" xmlns:aink="http://schemas.microsoft.com/office/drawing/2016/ink" xmlns:am3d="http://schemas.microsoft.com/office/drawing/2017/model3d" xmlns:o="urn:schemas-microsoft-com:office:office" xmlns:r="http://schemas.openxmlformats.org/officeDocument/2006/relationships" xmlns:m="http://schemas.openxmlformats.org/officeDocument/2006/math" xmlns:v="urn:schemas-microsoft-com:vml" xmlns:wp14="http://schemas.microsoft.com/office/word/2010/wordprocessingDrawing" xmlns:wp="http://schemas.openxmlformats.org/drawingml/2006/wordprocessingDrawing" xmlns:w10="urn:schemas-microsoft-com:office:word" xmlns:w="http://schemas.openxmlformats.org/wordprocessingml/2006/main" xmlns:w14="http://schemas.microsoft.com/office/word/2010/wordml" xmlns:w15="http://schemas.microsoft.com/office/word/2012/wordml" xmlns:w16cex="http://schemas.microsoft.com/office/word/2018/wordml/cex" xmlns:w16cid="http://schemas.microsoft.com/office/word/2016/wordml/cid" xmlns:w16="http://schemas.microsoft.com/office/word/2018/wordml" xmlns:w16sdtdh="http://schemas.microsoft.com/office/word/2020/wordml/sdtdatahash" xmlns:w16se="http://schemas.microsoft.com/office/word/2015/wordml/symex" xmlns:wpg="http://schemas.microsoft.com/office/word/2010/wordprocessingGroup" xmlns:wpi="http://schemas.microsoft.com/office/word/2010/wordprocessingInk" xmlns:wne="http://schemas.microsoft.com/office/word/2006/wordml" xmlns:wps="http://schemas.microsoft.com/office/word/2010/wordprocessingShape" mc:Ignorable="w14 w15 w16se w16cid w16 w16cex w16sdtdh wp14">
   <w:abstractNum w:abstractNumId="0" w15:restartNumberingAfterBreak="0">
-    <w:nsid w:val="2F5D4012"/>
+    <w:nsid w:val="160A34A0"/>
     <w:multiLevelType w:val="multilevel"/>
-    <w:tmpl w:val="82A8FFDE"/>
+    <w:tmpl w:val="3E42E21C"/>
+    <w:lvl w:ilvl="0">
+      <w:start w:val="1"/>
+      <w:numFmt w:val="bullet"/>
+      <w:lvlText w:val=""/>
+      <w:lvlJc w:val="left"/>
+      <w:pPr>
+        <w:tabs>
+          <w:tab w:val="num" w:pos="720"/>
+        </w:tabs>
+        <w:ind w:left="720" w:hanging="360"/>
+      </w:pPr>
+      <w:rPr>
+        <w:rFonts w:ascii="Symbol" w:hAnsi="Symbol" w:hint="default"/>
+        <w:sz w:val="20"/>
+      </w:rPr>
+    </w:lvl>
+    <w:lvl w:ilvl="1">
+      <w:start w:val="1"/>
+      <w:numFmt w:val="bullet"/>
+      <w:lvlText w:val="o"/>
+      <w:lvlJc w:val="left"/>
+      <w:pPr>
+        <w:tabs>
+          <w:tab w:val="num" w:pos="1440"/>
+        </w:tabs>
+        <w:ind w:left="1440" w:hanging="360"/>
+      </w:pPr>
+      <w:rPr>
+        <w:rFonts w:ascii="Courier New" w:hAnsi="Courier New" w:hint="default"/>
+        <w:sz w:val="20"/>
+      </w:rPr>
+    </w:lvl>
+    <w:lvl w:ilvl="2" w:tentative="1">
+      <w:start w:val="1"/>
+      <w:numFmt w:val="bullet"/>
+      <w:lvlText w:val=""/>
+      <w:lvlJc w:val="left"/>
+      <w:pPr>
+        <w:tabs>
+          <w:tab w:val="num" w:pos="2160"/>
+        </w:tabs>
+        <w:ind w:left="2160" w:hanging="360"/>
+      </w:pPr>
+      <w:rPr>
+        <w:rFonts w:ascii="Wingdings" w:hAnsi="Wingdings" w:hint="default"/>
+        <w:sz w:val="20"/>
+      </w:rPr>
+    </w:lvl>
+    <w:lvl w:ilvl="3" w:tentative="1">
+      <w:start w:val="1"/>
+      <w:numFmt w:val="bullet"/>
+      <w:lvlText w:val=""/>
+      <w:lvlJc w:val="left"/>
+      <w:pPr>
+        <w:tabs>
+          <w:tab w:val="num" w:pos="2880"/>
+        </w:tabs>
+        <w:ind w:left="2880" w:hanging="360"/>
+      </w:pPr>
+      <w:rPr>
+        <w:rFonts w:ascii="Wingdings" w:hAnsi="Wingdings" w:hint="default"/>
+        <w:sz w:val="20"/>
+      </w:rPr>
+    </w:lvl>
+    <w:lvl w:ilvl="4" w:tentative="1">
+      <w:start w:val="1"/>
+      <w:numFmt w:val="bullet"/>
+      <w:lvlText w:val=""/>
+      <w:lvlJc w:val="left"/>
+      <w:pPr>
+        <w:tabs>
+          <w:tab w:val="num" w:pos="3600"/>
+        </w:tabs>
+        <w:ind w:left="3600" w:hanging="360"/>
+      </w:pPr>
+      <w:rPr>
+        <w:rFonts w:ascii="Wingdings" w:hAnsi="Wingdings" w:hint="default"/>
+        <w:sz w:val="20"/>
+      </w:rPr>
+    </w:lvl>
+    <w:lvl w:ilvl="5" w:tentative="1">
+      <w:start w:val="1"/>
+      <w:numFmt w:val="bullet"/>
+      <w:lvlText w:val=""/>
+      <w:lvlJc w:val="left"/>
+      <w:pPr>
+        <w:tabs>
+          <w:tab w:val="num" w:pos="4320"/>
+        </w:tabs>
+        <w:ind w:left="4320" w:hanging="360"/>
+      </w:pPr>
+      <w:rPr>
+        <w:rFonts w:ascii="Wingdings" w:hAnsi="Wingdings" w:hint="default"/>
+        <w:sz w:val="20"/>
+      </w:rPr>
+    </w:lvl>
+    <w:lvl w:ilvl="6" w:tentative="1">
+      <w:start w:val="1"/>
+      <w:numFmt w:val="bullet"/>
+      <w:lvlText w:val=""/>
+      <w:lvlJc w:val="left"/>
+      <w:pPr>
+        <w:tabs>
+          <w:tab w:val="num" w:pos="5040"/>
+        </w:tabs>
+        <w:ind w:left="5040" w:hanging="360"/>
+      </w:pPr>
+      <w:rPr>
+        <w:rFonts w:ascii="Wingdings" w:hAnsi="Wingdings" w:hint="default"/>
+        <w:sz w:val="20"/>
+      </w:rPr>
+    </w:lvl>
+    <w:lvl w:ilvl="7" w:tentative="1">
+      <w:start w:val="1"/>
+      <w:numFmt w:val="bullet"/>
+      <w:lvlText w:val=""/>
+      <w:lvlJc w:val="left"/>
+      <w:pPr>
+        <w:tabs>
+          <w:tab w:val="num" w:pos="5760"/>
+        </w:tabs>
+        <w:ind w:left="5760" w:hanging="360"/>
+      </w:pPr>
+      <w:rPr>
+        <w:rFonts w:ascii="Wingdings" w:hAnsi="Wingdings" w:hint="default"/>
+        <w:sz w:val="20"/>
+      </w:rPr>
+    </w:lvl>
+    <w:lvl w:ilvl="8" w:tentative="1">
+      <w:start w:val="1"/>
+      <w:numFmt w:val="bullet"/>
+      <w:lvlText w:val=""/>
+      <w:lvlJc w:val="left"/>
+      <w:pPr>
+        <w:tabs>
+          <w:tab w:val="num" w:pos="6480"/>
+        </w:tabs>
+        <w:ind w:left="6480" w:hanging="360"/>
+      </w:pPr>
+      <w:rPr>
+        <w:rFonts w:ascii="Wingdings" w:hAnsi="Wingdings" w:hint="default"/>
+        <w:sz w:val="20"/>
+      </w:rPr>
+    </w:lvl>
+  </w:abstractNum>
+  <w:abstractNum w:abstractNumId="1" w15:restartNumberingAfterBreak="0">
+    <w:nsid w:val="5D24071F"/>
+    <w:multiLevelType w:val="multilevel"/>
+    <w:tmpl w:val="C63461D2"/>
     <w:lvl w:ilvl="0">
       <w:start w:val="1"/>
       <w:numFmt w:val="bullet"/>
@@ -6256,160 +7014,11 @@
       </w:rPr>
     </w:lvl>
   </w:abstractNum>
-  <w:abstractNum w:abstractNumId="1" w15:restartNumberingAfterBreak="0">
-    <w:nsid w:val="420903B2"/>
-    <w:multiLevelType w:val="multilevel"/>
-    <w:tmpl w:val="FA16CEFC"/>
-    <w:lvl w:ilvl="0">
-      <w:start w:val="1"/>
-      <w:numFmt w:val="bullet"/>
-      <w:lvlText w:val=""/>
-      <w:lvlJc w:val="left"/>
-      <w:pPr>
-        <w:tabs>
-          <w:tab w:val="num" w:pos="720"/>
-        </w:tabs>
-        <w:ind w:left="720" w:hanging="360"/>
-      </w:pPr>
-      <w:rPr>
-        <w:rFonts w:ascii="Symbol" w:hAnsi="Symbol" w:hint="default"/>
-        <w:sz w:val="20"/>
-      </w:rPr>
-    </w:lvl>
-    <w:lvl w:ilvl="1">
-      <w:start w:val="1"/>
-      <w:numFmt w:val="bullet"/>
-      <w:lvlText w:val="o"/>
-      <w:lvlJc w:val="left"/>
-      <w:pPr>
-        <w:tabs>
-          <w:tab w:val="num" w:pos="1440"/>
-        </w:tabs>
-        <w:ind w:left="1440" w:hanging="360"/>
-      </w:pPr>
-      <w:rPr>
-        <w:rFonts w:ascii="Courier New" w:hAnsi="Courier New" w:hint="default"/>
-        <w:sz w:val="20"/>
-      </w:rPr>
-    </w:lvl>
-    <w:lvl w:ilvl="2" w:tentative="1">
-      <w:start w:val="1"/>
-      <w:numFmt w:val="bullet"/>
-      <w:lvlText w:val=""/>
-      <w:lvlJc w:val="left"/>
-      <w:pPr>
-        <w:tabs>
-          <w:tab w:val="num" w:pos="2160"/>
-        </w:tabs>
-        <w:ind w:left="2160" w:hanging="360"/>
-      </w:pPr>
-      <w:rPr>
-        <w:rFonts w:ascii="Wingdings" w:hAnsi="Wingdings" w:hint="default"/>
-        <w:sz w:val="20"/>
-      </w:rPr>
-    </w:lvl>
-    <w:lvl w:ilvl="3" w:tentative="1">
-      <w:start w:val="1"/>
-      <w:numFmt w:val="bullet"/>
-      <w:lvlText w:val=""/>
-      <w:lvlJc w:val="left"/>
-      <w:pPr>
-        <w:tabs>
-          <w:tab w:val="num" w:pos="2880"/>
-        </w:tabs>
-        <w:ind w:left="2880" w:hanging="360"/>
-      </w:pPr>
-      <w:rPr>
-        <w:rFonts w:ascii="Wingdings" w:hAnsi="Wingdings" w:hint="default"/>
-        <w:sz w:val="20"/>
-      </w:rPr>
-    </w:lvl>
-    <w:lvl w:ilvl="4" w:tentative="1">
-      <w:start w:val="1"/>
-      <w:numFmt w:val="bullet"/>
-      <w:lvlText w:val=""/>
-      <w:lvlJc w:val="left"/>
-      <w:pPr>
-        <w:tabs>
-          <w:tab w:val="num" w:pos="3600"/>
-        </w:tabs>
-        <w:ind w:left="3600" w:hanging="360"/>
-      </w:pPr>
-      <w:rPr>
-        <w:rFonts w:ascii="Wingdings" w:hAnsi="Wingdings" w:hint="default"/>
-        <w:sz w:val="20"/>
-      </w:rPr>
-    </w:lvl>
-    <w:lvl w:ilvl="5" w:tentative="1">
-      <w:start w:val="1"/>
-      <w:numFmt w:val="bullet"/>
-      <w:lvlText w:val=""/>
-      <w:lvlJc w:val="left"/>
-      <w:pPr>
-        <w:tabs>
-          <w:tab w:val="num" w:pos="4320"/>
-        </w:tabs>
-        <w:ind w:left="4320" w:hanging="360"/>
-      </w:pPr>
-      <w:rPr>
-        <w:rFonts w:ascii="Wingdings" w:hAnsi="Wingdings" w:hint="default"/>
-        <w:sz w:val="20"/>
-      </w:rPr>
-    </w:lvl>
-    <w:lvl w:ilvl="6" w:tentative="1">
-      <w:start w:val="1"/>
-      <w:numFmt w:val="bullet"/>
-      <w:lvlText w:val=""/>
-      <w:lvlJc w:val="left"/>
-      <w:pPr>
-        <w:tabs>
-          <w:tab w:val="num" w:pos="5040"/>
-        </w:tabs>
-        <w:ind w:left="5040" w:hanging="360"/>
-      </w:pPr>
-      <w:rPr>
-        <w:rFonts w:ascii="Wingdings" w:hAnsi="Wingdings" w:hint="default"/>
-        <w:sz w:val="20"/>
-      </w:rPr>
-    </w:lvl>
-    <w:lvl w:ilvl="7" w:tentative="1">
-      <w:start w:val="1"/>
-      <w:numFmt w:val="bullet"/>
-      <w:lvlText w:val=""/>
-      <w:lvlJc w:val="left"/>
-      <w:pPr>
-        <w:tabs>
-          <w:tab w:val="num" w:pos="5760"/>
-        </w:tabs>
-        <w:ind w:left="5760" w:hanging="360"/>
-      </w:pPr>
-      <w:rPr>
-        <w:rFonts w:ascii="Wingdings" w:hAnsi="Wingdings" w:hint="default"/>
-        <w:sz w:val="20"/>
-      </w:rPr>
-    </w:lvl>
-    <w:lvl w:ilvl="8" w:tentative="1">
-      <w:start w:val="1"/>
-      <w:numFmt w:val="bullet"/>
-      <w:lvlText w:val=""/>
-      <w:lvlJc w:val="left"/>
-      <w:pPr>
-        <w:tabs>
-          <w:tab w:val="num" w:pos="6480"/>
-        </w:tabs>
-        <w:ind w:left="6480" w:hanging="360"/>
-      </w:pPr>
-      <w:rPr>
-        <w:rFonts w:ascii="Wingdings" w:hAnsi="Wingdings" w:hint="default"/>
-        <w:sz w:val="20"/>
-      </w:rPr>
-    </w:lvl>
-  </w:abstractNum>
   <w:num w:numId="1">
-    <w:abstractNumId w:val="0"/>
+    <w:abstractNumId w:val="1"/>
   </w:num>
   <w:num w:numId="2">
-    <w:abstractNumId w:val="1"/>
+    <w:abstractNumId w:val="0"/>
   </w:num>
 </w:numbering>
 </file>

</xml_diff>